<commit_message>
Aktualisiere KF IT-Strategie: Go-live 1. Oktober 2026, RTX 4090 aktiv
- Odoo Go-live auf 1. Oktober 2026 festgelegt
- RTX 4090 von "In Planung" auf "Läuft" gesetzt
- RTX 3060 Ti entfernt (nicht mehr im Betrieb)
- Reverse Proxy + HTTPS als "Läuft" markiert
- Erste Datenmigration eEvolution → Odoo als "Abgeschlossen" markiert
- Subdomain als einziger offener Punkt hervorgehoben

https://claude.ai/code/session_01XgHFZv7q1dqEJspr4u3QXb
</commit_message>
<xml_diff>
--- a/KF_IT_Strategie_Digitalisierungsfahrplan_2026.docx
+++ b/KF_IT_Strategie_Digitalisierungsfahrplan_2026.docx
@@ -26,6 +26,7 @@
               <w:rPr>
                 <w:rFonts w:ascii="Calibri" w:hAnsi="Calibri"/>
                 <w:b/>
+                <w:i w:val="0"/>
                 <w:color w:val="FFFFFF"/>
                 <w:sz w:val="56"/>
               </w:rPr>
@@ -40,6 +41,8 @@
             <w:r>
               <w:rPr>
                 <w:rFonts w:ascii="Calibri" w:hAnsi="Calibri"/>
+                <w:b w:val="0"/>
+                <w:i w:val="0"/>
                 <w:color w:val="B0C4D8"/>
                 <w:sz w:val="32"/>
               </w:rPr>
@@ -54,6 +57,7 @@
             <w:r>
               <w:rPr>
                 <w:rFonts w:ascii="Calibri" w:hAnsi="Calibri"/>
+                <w:b w:val="0"/>
                 <w:i/>
                 <w:color w:val="B0C4D8"/>
                 <w:sz w:val="22"/>
@@ -88,6 +92,7 @@
       <w:r>
         <w:rPr>
           <w:rFonts w:ascii="Calibri" w:hAnsi="Calibri"/>
+          <w:b w:val="0"/>
           <w:i/>
           <w:color w:val="6C849B"/>
           <w:sz w:val="26"/>
@@ -103,10 +108,12 @@
       <w:r>
         <w:rPr>
           <w:rFonts w:ascii="Calibri" w:hAnsi="Calibri"/>
+          <w:b w:val="0"/>
+          <w:i/>
           <w:color w:val="6C849B"/>
           <w:sz w:val="20"/>
         </w:rPr>
-        <w:t>Stand: Juni 2026  |  Intern – Vertraulich</w:t>
+        <w:t>Stand: Juni 2026  |  Odoo Go-live: 1. Oktober 2026  |  Intern – Vertraulich</w:t>
       </w:r>
     </w:p>
     <w:tbl>
@@ -163,37 +170,7 @@
           <w:color w:val="1A1A2E"/>
           <w:sz w:val="21"/>
         </w:rPr>
-        <w:t>Kling &amp; Freitag GmbH ist ein etablierter deutscher Hersteller professioneller Audio- und Beschallungssysteme mit Sitz in Hannover. Das Unternehmen steht vor einer tiefgreifenden digitalen Transformation seiner gesamten IT-Landschaft – vom ERP-System über das Dokumentenmanagement bis hin zur Einführung lokaler KI-Systeme.</w:t>
-      </w:r>
-    </w:p>
-    <w:p>
-      <w:pPr>
-        <w:spacing w:before="40" w:after="60"/>
-      </w:pPr>
-      <w:r>
-        <w:rPr>
-          <w:rFonts w:ascii="Calibri" w:hAnsi="Calibri"/>
-          <w:color w:val="1A1A2E"/>
-          <w:sz w:val="21"/>
-        </w:rPr>
-        <w:t>Die vorliegende Strategie fasst Gegenwart, laufende Projekte und die langfristige Zielvision zusammen. Sie bildet die Grundlage für Investitionsentscheidungen, Projektpriorisierungen und die Kommunikation mit internen und externen Stakeholdern.</w:t>
-      </w:r>
-    </w:p>
-    <w:p>
-      <w:pPr>
-        <w:spacing w:before="280" w:after="120"/>
-        <w:pBdr>
-          <w:bottom w:val="single" w:sz="4" w:color="E85D04"/>
-        </w:pBdr>
-      </w:pPr>
-      <w:r>
-        <w:rPr>
-          <w:rFonts w:ascii="Calibri" w:hAnsi="Calibri"/>
-          <w:b/>
-          <w:color w:val="E85D04"/>
-          <w:sz w:val="26"/>
-        </w:rPr>
-        <w:t>Kernaussagen auf einen Blick</w:t>
+        <w:t>Kling &amp; Freitag GmbH befindet sich mitten in einer tiefgreifenden digitalen Transformation. Der Aufbau von Odoo Enterprise 19 ist weit fortgeschritten – der geplante Go-live ist der 1. Oktober 2026. Reverse Proxy und HTTPS laufen bereits; die erste Datenmigration aus eEvolution ist abgeschlossen. Die lokale KI-Infrastruktur (RTX 4090, Ollama) ist produktionsbereit.</w:t>
       </w:r>
     </w:p>
     <w:tbl>
@@ -244,7 +221,7 @@
                 <w:color w:val="FFFFFF"/>
                 <w:sz w:val="20"/>
               </w:rPr>
-              <w:t>Inhalt</w:t>
+              <w:t>Status / Inhalt</w:t>
             </w:r>
           </w:p>
         </w:tc>
@@ -328,7 +305,7 @@
                 <w:color w:val="1A1A2E"/>
                 <w:sz w:val="20"/>
               </w:rPr>
-              <w:t>ERP heute</w:t>
+              <w:t>ERP Ist</w:t>
             </w:r>
           </w:p>
         </w:tc>
@@ -340,10 +317,76 @@
             <w:r>
               <w:rPr>
                 <w:rFonts w:ascii="Calibri" w:hAnsi="Calibri"/>
+                <w:color w:val="1B7A47"/>
+                <w:sz w:val="20"/>
+              </w:rPr>
+              <w:t>eEvolution – Ablösung läuft, erste Datenmigration abgeschlossen</w:t>
+            </w:r>
+          </w:p>
+        </w:tc>
+      </w:tr>
+      <w:tr>
+        <w:tc>
+          <w:tcPr>
+            <w:tcW w:type="dxa" w:w="4536"/>
+            <w:shd w:val="clear" w:color="auto" w:fill="EEF3F8"/>
+          </w:tcPr>
+          <w:p>
+            <w:r>
+              <w:rPr>
+                <w:rFonts w:ascii="Calibri" w:hAnsi="Calibri"/>
                 <w:color w:val="1A1A2E"/>
                 <w:sz w:val="20"/>
               </w:rPr>
-              <w:t>eEvolution – seit 20+ Jahren, Ablösung durch Odoo Enterprise 19 geplant</w:t>
+              <w:t>ERP Ziel</w:t>
+            </w:r>
+          </w:p>
+        </w:tc>
+        <w:tc>
+          <w:tcPr>
+            <w:tcW w:type="dxa" w:w="4536"/>
+          </w:tcPr>
+          <w:p>
+            <w:r>
+              <w:rPr>
+                <w:rFonts w:ascii="Calibri" w:hAnsi="Calibri"/>
+                <w:color w:val="C01050"/>
+                <w:sz w:val="20"/>
+              </w:rPr>
+              <w:t>Odoo Enterprise 19 – Go-live: 1. Oktober 2026</w:t>
+            </w:r>
+          </w:p>
+        </w:tc>
+      </w:tr>
+      <w:tr>
+        <w:tc>
+          <w:tcPr>
+            <w:tcW w:type="dxa" w:w="4536"/>
+            <w:shd w:val="clear" w:color="auto" w:fill="EEF3F8"/>
+          </w:tcPr>
+          <w:p>
+            <w:r>
+              <w:rPr>
+                <w:rFonts w:ascii="Calibri" w:hAnsi="Calibri"/>
+                <w:color w:val="1A1A2E"/>
+                <w:sz w:val="20"/>
+              </w:rPr>
+              <w:t>Odoo Stand</w:t>
+            </w:r>
+          </w:p>
+        </w:tc>
+        <w:tc>
+          <w:tcPr>
+            <w:tcW w:type="dxa" w:w="4536"/>
+          </w:tcPr>
+          <w:p>
+            <w:r>
+              <w:rPr>
+                <w:rFonts w:ascii="Calibri" w:hAnsi="Calibri"/>
+                <w:color w:val="1B7A47"/>
+                <w:sz w:val="20"/>
+              </w:rPr>
+              <w:t>Reverse Proxy + HTTPS läuft, Subdomain ausstehend</w:t>
             </w:r>
           </w:p>
         </w:tc>
@@ -373,10 +416,10 @@
             <w:r>
               <w:rPr>
                 <w:rFonts w:ascii="Calibri" w:hAnsi="Calibri"/>
-                <w:color w:val="1A1A2E"/>
+                <w:color w:val="1B7A47"/>
                 <w:sz w:val="20"/>
               </w:rPr>
-              <w:t>bitfarm-Archiv Enterprise 3.6.2 – Aufbau läuft aktiv</w:t>
+              <w:t>bitfarm-Archiv Enterprise 3.6.2 – Aufbau aktiv</w:t>
             </w:r>
           </w:p>
         </w:tc>
@@ -406,10 +449,10 @@
             <w:r>
               <w:rPr>
                 <w:rFonts w:ascii="Calibri" w:hAnsi="Calibri"/>
-                <w:color w:val="1A1A2E"/>
+                <w:color w:val="1B7A47"/>
                 <w:sz w:val="20"/>
               </w:rPr>
-              <w:t>Lokales Ollama-System (qwen3:8b / qwen2.5:72b), RTX 4090 in Planung</w:t>
+              <w:t>Ollama (qwen3:8b / qwen2.5:72b) – RTX 4090 läuft</w:t>
             </w:r>
           </w:p>
         </w:tc>
@@ -427,7 +470,7 @@
                 <w:color w:val="1A1A2E"/>
                 <w:sz w:val="20"/>
               </w:rPr>
-              <w:t>Ziel</w:t>
+              <w:t>Ziel 2027</w:t>
             </w:r>
           </w:p>
         </w:tc>
@@ -468,23 +511,6 @@
     </w:p>
     <w:p>
       <w:pPr>
-        <w:spacing w:before="280" w:after="120"/>
-        <w:pBdr>
-          <w:bottom w:val="single" w:sz="4" w:color="E85D04"/>
-        </w:pBdr>
-      </w:pPr>
-      <w:r>
-        <w:rPr>
-          <w:rFonts w:ascii="Calibri" w:hAnsi="Calibri"/>
-          <w:b/>
-          <w:color w:val="E85D04"/>
-          <w:sz w:val="26"/>
-        </w:rPr>
-        <w:t>2.1 Profil</w:t>
-      </w:r>
-    </w:p>
-    <w:p>
-      <w:pPr>
         <w:spacing w:before="40" w:after="60"/>
       </w:pPr>
       <w:r>
@@ -493,7 +519,7 @@
           <w:color w:val="1A1A2E"/>
           <w:sz w:val="21"/>
         </w:rPr>
-        <w:t>Kling &amp; Freitag GmbH entwickelt und produziert hochwertige Lautsprechersysteme für Touring, Installation und professionelle Beschallungslösungen. Mit ca. 30 Mitarbeitern und einem Jahresumsatz von ca. 6 Mio. € ist das Unternehmen im Premium-Segment der Professional-Audio-Branche positioniert.</w:t>
+        <w:t>Kling &amp; Freitag GmbH entwickelt und produziert hochwertige Lautsprechersysteme für Touring, Installation und professionelle Beschallungslösungen (Hannover). Mit ca. 30 Mitarbeitern und ~6 Mio. € Jahresumsatz ist das Unternehmen im Premium-Segment der Professional-Audio-Branche positioniert.</w:t>
       </w:r>
     </w:p>
     <w:tbl>
@@ -727,7 +753,7 @@
                 <w:color w:val="1A1A2E"/>
                 <w:sz w:val="20"/>
               </w:rPr>
-              <w:t>Märkte</w:t>
+              <w:t>IT-Governance</w:t>
             </w:r>
           </w:p>
         </w:tc>
@@ -742,42 +768,12 @@
                 <w:color w:val="1A1A2E"/>
                 <w:sz w:val="20"/>
               </w:rPr>
-              <w:t>Deutschland / International – Professioneller Audiosektor</w:t>
+              <w:t>Strategische IT-Hoheit vollständig intern</w:t>
             </w:r>
           </w:p>
         </w:tc>
       </w:tr>
     </w:tbl>
-    <w:p>
-      <w:pPr>
-        <w:spacing w:before="280" w:after="120"/>
-        <w:pBdr>
-          <w:bottom w:val="single" w:sz="4" w:color="E85D04"/>
-        </w:pBdr>
-      </w:pPr>
-      <w:r>
-        <w:rPr>
-          <w:rFonts w:ascii="Calibri" w:hAnsi="Calibri"/>
-          <w:b/>
-          <w:color w:val="E85D04"/>
-          <w:sz w:val="26"/>
-        </w:rPr>
-        <w:t>2.2 IT-Governance</w:t>
-      </w:r>
-    </w:p>
-    <w:p>
-      <w:pPr>
-        <w:spacing w:before="40" w:after="60"/>
-      </w:pPr>
-      <w:r>
-        <w:rPr>
-          <w:rFonts w:ascii="Calibri" w:hAnsi="Calibri"/>
-          <w:color w:val="1A1A2E"/>
-          <w:sz w:val="21"/>
-        </w:rPr>
-        <w:t>Die gesamte IT-Infrastruktur wird intern betrieben und administriert. Externe Dienstleister werden punktuell für Spezialprojekte hinzugezogen. Die strategische IT-Hoheit liegt vollständig bei Kling &amp; Freitag, was maximale Flexibilität, Datenschutz und Kostenkontrolle gewährleistet.</w:t>
-      </w:r>
-    </w:p>
     <w:p>
       <w:r>
         <w:br w:type="page"/>
@@ -797,12 +793,12 @@
           <w:color w:val="0F3D6B"/>
           <w:sz w:val="32"/>
         </w:rPr>
-        <w:t>3. Ist-Zustand der IT-Landschaft</w:t>
+        <w:t>3. Ist-Zustand der IT-Landschaft (Juni 2026)</w:t>
       </w:r>
     </w:p>
     <w:p>
       <w:pPr>
-        <w:spacing w:before="280" w:after="120"/>
+        <w:spacing w:before="200" w:after="80"/>
         <w:pBdr>
           <w:bottom w:val="single" w:sz="4" w:color="E85D04"/>
         </w:pBdr>
@@ -814,7 +810,7 @@
           <w:color w:val="E85D04"/>
           <w:sz w:val="26"/>
         </w:rPr>
-        <w:t>3.1 ERP-System – eEvolution (Bestand)</w:t>
+        <w:t>3.1 ERP – eEvolution (Bestand / Ablösung)</w:t>
       </w:r>
     </w:p>
     <w:p>
@@ -827,80 +823,7 @@
           <w:color w:val="1A1A2E"/>
           <w:sz w:val="21"/>
         </w:rPr>
-        <w:t>Das ERP-System eEvolution ist seit über 20 Jahren produktiv im Einsatz und deckt alle wesentlichen Unternehmensprozesse ab. Es läuft auf einem SQL Server 2019 mit einer Datenbankgröße von ca. 20 GB.</w:t>
-      </w:r>
-    </w:p>
-    <w:p>
-      <w:pPr>
-        <w:pStyle w:val="ListBullet"/>
-        <w:spacing w:before="20" w:after="20"/>
-        <w:ind w:left="283"/>
-      </w:pPr>
-      <w:r>
-        <w:rPr>
-          <w:rFonts w:ascii="Calibri" w:hAnsi="Calibri"/>
-          <w:color w:val="1A1A2E"/>
-          <w:sz w:val="21"/>
-        </w:rPr>
-        <w:t>Seriennummern- und Chargenverwaltung</w:t>
-      </w:r>
-    </w:p>
-    <w:p>
-      <w:pPr>
-        <w:pStyle w:val="ListBullet"/>
-        <w:spacing w:before="20" w:after="20"/>
-        <w:ind w:left="283"/>
-      </w:pPr>
-      <w:r>
-        <w:rPr>
-          <w:rFonts w:ascii="Calibri" w:hAnsi="Calibri"/>
-          <w:color w:val="1A1A2E"/>
-          <w:sz w:val="21"/>
-        </w:rPr>
-        <w:t>Fertigungs- und Produktionsprozesse</w:t>
-      </w:r>
-    </w:p>
-    <w:p>
-      <w:pPr>
-        <w:pStyle w:val="ListBullet"/>
-        <w:spacing w:before="20" w:after="20"/>
-        <w:ind w:left="283"/>
-      </w:pPr>
-      <w:r>
-        <w:rPr>
-          <w:rFonts w:ascii="Calibri" w:hAnsi="Calibri"/>
-          <w:color w:val="1A1A2E"/>
-          <w:sz w:val="21"/>
-        </w:rPr>
-        <w:t>Einkauf, Verkauf, Lagerverwaltung</w:t>
-      </w:r>
-    </w:p>
-    <w:p>
-      <w:pPr>
-        <w:pStyle w:val="ListBullet"/>
-        <w:spacing w:before="20" w:after="20"/>
-        <w:ind w:left="283"/>
-      </w:pPr>
-      <w:r>
-        <w:rPr>
-          <w:rFonts w:ascii="Calibri" w:hAnsi="Calibri"/>
-          <w:color w:val="1A1A2E"/>
-          <w:sz w:val="21"/>
-        </w:rPr>
-        <w:t>Buchhaltung und Finanzen</w:t>
-      </w:r>
-    </w:p>
-    <w:p>
-      <w:pPr>
-        <w:spacing w:before="40" w:after="60"/>
-      </w:pPr>
-      <w:r>
-        <w:rPr>
-          <w:rFonts w:ascii="Calibri" w:hAnsi="Calibri"/>
-          <w:color w:val="1A1A2E"/>
-          <w:sz w:val="21"/>
-        </w:rPr>
-        <w:t>Aktuelle Lizenz- und Supportkosten:</w:t>
+        <w:t>eEvolution ist seit über 20 Jahren produktiv im Einsatz. Die Migration zu Odoo Enterprise 19 läuft aktiv – die erste Datenübernahme ist abgeschlossen. Parallelbetrieb bis Odoo Go-live am 1. Oktober 2026.</w:t>
       </w:r>
     </w:p>
     <w:tbl>
@@ -931,7 +854,7 @@
                 <w:color w:val="FFFFFF"/>
                 <w:sz w:val="20"/>
               </w:rPr>
-              <w:t>Position</w:t>
+              <w:t>Parameter</w:t>
             </w:r>
           </w:p>
         </w:tc>
@@ -951,7 +874,106 @@
                 <w:color w:val="FFFFFF"/>
                 <w:sz w:val="20"/>
               </w:rPr>
-              <w:t>Betrag</w:t>
+              <w:t>Wert</w:t>
+            </w:r>
+          </w:p>
+        </w:tc>
+      </w:tr>
+      <w:tr>
+        <w:tc>
+          <w:tcPr>
+            <w:tcW w:type="dxa" w:w="4536"/>
+            <w:shd w:val="clear" w:color="auto" w:fill="EEF3F8"/>
+          </w:tcPr>
+          <w:p>
+            <w:r>
+              <w:rPr>
+                <w:rFonts w:ascii="Calibri" w:hAnsi="Calibri"/>
+                <w:color w:val="1A1A2E"/>
+                <w:sz w:val="20"/>
+              </w:rPr>
+              <w:t>Datenbank</w:t>
+            </w:r>
+          </w:p>
+        </w:tc>
+        <w:tc>
+          <w:tcPr>
+            <w:tcW w:type="dxa" w:w="4536"/>
+          </w:tcPr>
+          <w:p>
+            <w:r>
+              <w:rPr>
+                <w:rFonts w:ascii="Calibri" w:hAnsi="Calibri"/>
+                <w:color w:val="1A1A2E"/>
+                <w:sz w:val="20"/>
+              </w:rPr>
+              <w:t>SQL Server 2019, ca. 20 GB</w:t>
+            </w:r>
+          </w:p>
+        </w:tc>
+      </w:tr>
+      <w:tr>
+        <w:tc>
+          <w:tcPr>
+            <w:tcW w:type="dxa" w:w="4536"/>
+            <w:shd w:val="clear" w:color="auto" w:fill="EEF3F8"/>
+          </w:tcPr>
+          <w:p>
+            <w:r>
+              <w:rPr>
+                <w:rFonts w:ascii="Calibri" w:hAnsi="Calibri"/>
+                <w:color w:val="1A1A2E"/>
+                <w:sz w:val="20"/>
+              </w:rPr>
+              <w:t>Betrieb</w:t>
+            </w:r>
+          </w:p>
+        </w:tc>
+        <w:tc>
+          <w:tcPr>
+            <w:tcW w:type="dxa" w:w="4536"/>
+          </w:tcPr>
+          <w:p>
+            <w:r>
+              <w:rPr>
+                <w:rFonts w:ascii="Calibri" w:hAnsi="Calibri"/>
+                <w:color w:val="1B7A47"/>
+                <w:sz w:val="20"/>
+              </w:rPr>
+              <w:t>Produktiv – parallel zu Odoo-Aufbau</w:t>
+            </w:r>
+          </w:p>
+        </w:tc>
+      </w:tr>
+      <w:tr>
+        <w:tc>
+          <w:tcPr>
+            <w:tcW w:type="dxa" w:w="4536"/>
+            <w:shd w:val="clear" w:color="auto" w:fill="EEF3F8"/>
+          </w:tcPr>
+          <w:p>
+            <w:r>
+              <w:rPr>
+                <w:rFonts w:ascii="Calibri" w:hAnsi="Calibri"/>
+                <w:color w:val="1A1A2E"/>
+                <w:sz w:val="20"/>
+              </w:rPr>
+              <w:t>Erste Datenmigration</w:t>
+            </w:r>
+          </w:p>
+        </w:tc>
+        <w:tc>
+          <w:tcPr>
+            <w:tcW w:type="dxa" w:w="4536"/>
+          </w:tcPr>
+          <w:p>
+            <w:r>
+              <w:rPr>
+                <w:rFonts w:ascii="Calibri" w:hAnsi="Calibri"/>
+                <w:color w:val="1B7A47"/>
+                <w:sz w:val="20"/>
+              </w:rPr>
+              <w:t>Abgeschlossen</w:t>
             </w:r>
           </w:p>
         </w:tc>
@@ -1035,7 +1057,111 @@
                 <w:color w:val="1A1A2E"/>
                 <w:sz w:val="20"/>
               </w:rPr>
-              <w:t>Gesamtkosten</w:t>
+              <w:t>Abschaltung</w:t>
+            </w:r>
+          </w:p>
+        </w:tc>
+        <w:tc>
+          <w:tcPr>
+            <w:tcW w:type="dxa" w:w="4536"/>
+          </w:tcPr>
+          <w:p>
+            <w:r>
+              <w:rPr>
+                <w:rFonts w:ascii="Calibri" w:hAnsi="Calibri"/>
+                <w:color w:val="C01050"/>
+                <w:sz w:val="20"/>
+              </w:rPr>
+              <w:t>Nach Odoo Go-live (1. Oktober 2026)</w:t>
+            </w:r>
+          </w:p>
+        </w:tc>
+      </w:tr>
+    </w:tbl>
+    <w:p>
+      <w:pPr>
+        <w:spacing w:before="200" w:after="80"/>
+        <w:pBdr>
+          <w:bottom w:val="single" w:sz="4" w:color="E85D04"/>
+        </w:pBdr>
+      </w:pPr>
+      <w:r>
+        <w:rPr>
+          <w:rFonts w:ascii="Calibri" w:hAnsi="Calibri"/>
+          <w:b/>
+          <w:color w:val="E85D04"/>
+          <w:sz w:val="26"/>
+        </w:rPr>
+        <w:t>3.2 Odoo Enterprise 19 – aktueller Umsetzungsstand</w:t>
+      </w:r>
+    </w:p>
+    <w:tbl>
+      <w:tblPr>
+        <w:tblStyle w:val="TableGrid"/>
+        <w:tblW w:type="auto" w:w="0"/>
+        <w:jc w:val="center"/>
+        <w:tblLook w:firstColumn="1" w:firstRow="1" w:lastColumn="0" w:lastRow="0" w:noHBand="0" w:noVBand="1" w:val="04A0"/>
+      </w:tblPr>
+      <w:tblGrid>
+        <w:gridCol w:w="4536"/>
+        <w:gridCol w:w="4536"/>
+      </w:tblGrid>
+      <w:tr>
+        <w:tc>
+          <w:tcPr>
+            <w:tcW w:type="dxa" w:w="4536"/>
+            <w:shd w:val="clear" w:color="auto" w:fill="0F3D6B"/>
+          </w:tcPr>
+          <w:p>
+            <w:pPr>
+              <w:jc w:val="center"/>
+            </w:pPr>
+            <w:r>
+              <w:rPr>
+                <w:rFonts w:ascii="Calibri" w:hAnsi="Calibri"/>
+                <w:b/>
+                <w:color w:val="FFFFFF"/>
+                <w:sz w:val="20"/>
+              </w:rPr>
+              <w:t>Komponente</w:t>
+            </w:r>
+          </w:p>
+        </w:tc>
+        <w:tc>
+          <w:tcPr>
+            <w:tcW w:type="dxa" w:w="4536"/>
+            <w:shd w:val="clear" w:color="auto" w:fill="0F3D6B"/>
+          </w:tcPr>
+          <w:p>
+            <w:pPr>
+              <w:jc w:val="center"/>
+            </w:pPr>
+            <w:r>
+              <w:rPr>
+                <w:rFonts w:ascii="Calibri" w:hAnsi="Calibri"/>
+                <w:b/>
+                <w:color w:val="FFFFFF"/>
+                <w:sz w:val="20"/>
+              </w:rPr>
+              <w:t>Status</w:t>
+            </w:r>
+          </w:p>
+        </w:tc>
+      </w:tr>
+      <w:tr>
+        <w:tc>
+          <w:tcPr>
+            <w:tcW w:type="dxa" w:w="4536"/>
+            <w:shd w:val="clear" w:color="auto" w:fill="EEF3F8"/>
+          </w:tcPr>
+          <w:p>
+            <w:r>
+              <w:rPr>
+                <w:rFonts w:ascii="Calibri" w:hAnsi="Calibri"/>
+                <w:color w:val="1A1A2E"/>
+                <w:sz w:val="20"/>
+              </w:rPr>
+              <w:t>VM / Hostname</w:t>
             </w:r>
           </w:p>
         </w:tc>
@@ -1050,7 +1176,304 @@
                 <w:color w:val="1A1A2E"/>
                 <w:sz w:val="20"/>
               </w:rPr>
-              <w:t>ca. 42.000 € / Jahr</w:t>
+              <w:t>SV-Odoo-erp / odoo-erp</w:t>
+            </w:r>
+          </w:p>
+        </w:tc>
+      </w:tr>
+      <w:tr>
+        <w:tc>
+          <w:tcPr>
+            <w:tcW w:type="dxa" w:w="4536"/>
+            <w:shd w:val="clear" w:color="auto" w:fill="EEF3F8"/>
+          </w:tcPr>
+          <w:p>
+            <w:r>
+              <w:rPr>
+                <w:rFonts w:ascii="Calibri" w:hAnsi="Calibri"/>
+                <w:color w:val="1A1A2E"/>
+                <w:sz w:val="20"/>
+              </w:rPr>
+              <w:t>OS</w:t>
+            </w:r>
+          </w:p>
+        </w:tc>
+        <w:tc>
+          <w:tcPr>
+            <w:tcW w:type="dxa" w:w="4536"/>
+          </w:tcPr>
+          <w:p>
+            <w:r>
+              <w:rPr>
+                <w:rFonts w:ascii="Calibri" w:hAnsi="Calibri"/>
+                <w:color w:val="1A1A2E"/>
+                <w:sz w:val="20"/>
+              </w:rPr>
+              <w:t>Ubuntu Server 24.04.4 LTS</w:t>
+            </w:r>
+          </w:p>
+        </w:tc>
+      </w:tr>
+      <w:tr>
+        <w:tc>
+          <w:tcPr>
+            <w:tcW w:type="dxa" w:w="4536"/>
+            <w:shd w:val="clear" w:color="auto" w:fill="EEF3F8"/>
+          </w:tcPr>
+          <w:p>
+            <w:r>
+              <w:rPr>
+                <w:rFonts w:ascii="Calibri" w:hAnsi="Calibri"/>
+                <w:color w:val="1A1A2E"/>
+                <w:sz w:val="20"/>
+              </w:rPr>
+              <w:t>Hardware</w:t>
+            </w:r>
+          </w:p>
+        </w:tc>
+        <w:tc>
+          <w:tcPr>
+            <w:tcW w:type="dxa" w:w="4536"/>
+          </w:tcPr>
+          <w:p>
+            <w:r>
+              <w:rPr>
+                <w:rFonts w:ascii="Calibri" w:hAnsi="Calibri"/>
+                <w:color w:val="1A1A2E"/>
+                <w:sz w:val="20"/>
+              </w:rPr>
+              <w:t>6 vCPU / 16 GB RAM</w:t>
+            </w:r>
+          </w:p>
+        </w:tc>
+      </w:tr>
+      <w:tr>
+        <w:tc>
+          <w:tcPr>
+            <w:tcW w:type="dxa" w:w="4536"/>
+            <w:shd w:val="clear" w:color="auto" w:fill="EEF3F8"/>
+          </w:tcPr>
+          <w:p>
+            <w:r>
+              <w:rPr>
+                <w:rFonts w:ascii="Calibri" w:hAnsi="Calibri"/>
+                <w:color w:val="1A1A2E"/>
+                <w:sz w:val="20"/>
+              </w:rPr>
+              <w:t>Datenbank</w:t>
+            </w:r>
+          </w:p>
+        </w:tc>
+        <w:tc>
+          <w:tcPr>
+            <w:tcW w:type="dxa" w:w="4536"/>
+          </w:tcPr>
+          <w:p>
+            <w:r>
+              <w:rPr>
+                <w:rFonts w:ascii="Calibri" w:hAnsi="Calibri"/>
+                <w:color w:val="1B7A47"/>
+                <w:sz w:val="20"/>
+              </w:rPr>
+              <w:t>PostgreSQL 16 | Produktivdatenbank: kuf-erp</w:t>
+            </w:r>
+          </w:p>
+        </w:tc>
+      </w:tr>
+      <w:tr>
+        <w:tc>
+          <w:tcPr>
+            <w:tcW w:type="dxa" w:w="4536"/>
+            <w:shd w:val="clear" w:color="auto" w:fill="EEF3F8"/>
+          </w:tcPr>
+          <w:p>
+            <w:r>
+              <w:rPr>
+                <w:rFonts w:ascii="Calibri" w:hAnsi="Calibri"/>
+                <w:color w:val="1A1A2E"/>
+                <w:sz w:val="20"/>
+              </w:rPr>
+              <w:t>Reverse Proxy + HTTPS</w:t>
+            </w:r>
+          </w:p>
+        </w:tc>
+        <w:tc>
+          <w:tcPr>
+            <w:tcW w:type="dxa" w:w="4536"/>
+          </w:tcPr>
+          <w:p>
+            <w:r>
+              <w:rPr>
+                <w:rFonts w:ascii="Calibri" w:hAnsi="Calibri"/>
+                <w:color w:val="1B7A47"/>
+                <w:sz w:val="20"/>
+              </w:rPr>
+              <w:t>Läuft</w:t>
+            </w:r>
+          </w:p>
+        </w:tc>
+      </w:tr>
+      <w:tr>
+        <w:tc>
+          <w:tcPr>
+            <w:tcW w:type="dxa" w:w="4536"/>
+            <w:shd w:val="clear" w:color="auto" w:fill="EEF3F8"/>
+          </w:tcPr>
+          <w:p>
+            <w:r>
+              <w:rPr>
+                <w:rFonts w:ascii="Calibri" w:hAnsi="Calibri"/>
+                <w:color w:val="1A1A2E"/>
+                <w:sz w:val="20"/>
+              </w:rPr>
+              <w:t>Subdomain (Webserver)</w:t>
+            </w:r>
+          </w:p>
+        </w:tc>
+        <w:tc>
+          <w:tcPr>
+            <w:tcW w:type="dxa" w:w="4536"/>
+          </w:tcPr>
+          <w:p>
+            <w:r>
+              <w:rPr>
+                <w:rFonts w:ascii="Calibri" w:hAnsi="Calibri"/>
+                <w:color w:val="B86E00"/>
+                <w:sz w:val="20"/>
+              </w:rPr>
+              <w:t>Ausstehend – letzter offener Punkt</w:t>
+            </w:r>
+          </w:p>
+        </w:tc>
+      </w:tr>
+      <w:tr>
+        <w:tc>
+          <w:tcPr>
+            <w:tcW w:type="dxa" w:w="4536"/>
+            <w:shd w:val="clear" w:color="auto" w:fill="EEF3F8"/>
+          </w:tcPr>
+          <w:p>
+            <w:r>
+              <w:rPr>
+                <w:rFonts w:ascii="Calibri" w:hAnsi="Calibri"/>
+                <w:color w:val="1A1A2E"/>
+                <w:sz w:val="20"/>
+              </w:rPr>
+              <w:t>VPN-Zugriff</w:t>
+            </w:r>
+          </w:p>
+        </w:tc>
+        <w:tc>
+          <w:tcPr>
+            <w:tcW w:type="dxa" w:w="4536"/>
+          </w:tcPr>
+          <w:p>
+            <w:r>
+              <w:rPr>
+                <w:rFonts w:ascii="Calibri" w:hAnsi="Calibri"/>
+                <w:color w:val="B86E00"/>
+                <w:sz w:val="20"/>
+              </w:rPr>
+              <w:t>In Planung</w:t>
+            </w:r>
+          </w:p>
+        </w:tc>
+      </w:tr>
+      <w:tr>
+        <w:tc>
+          <w:tcPr>
+            <w:tcW w:type="dxa" w:w="4536"/>
+            <w:shd w:val="clear" w:color="auto" w:fill="EEF3F8"/>
+          </w:tcPr>
+          <w:p>
+            <w:r>
+              <w:rPr>
+                <w:rFonts w:ascii="Calibri" w:hAnsi="Calibri"/>
+                <w:color w:val="1A1A2E"/>
+                <w:sz w:val="20"/>
+              </w:rPr>
+              <w:t>Mobile App / Barcode</w:t>
+            </w:r>
+          </w:p>
+        </w:tc>
+        <w:tc>
+          <w:tcPr>
+            <w:tcW w:type="dxa" w:w="4536"/>
+          </w:tcPr>
+          <w:p>
+            <w:r>
+              <w:rPr>
+                <w:rFonts w:ascii="Calibri" w:hAnsi="Calibri"/>
+                <w:color w:val="B86E00"/>
+                <w:sz w:val="20"/>
+              </w:rPr>
+              <w:t>In Planung</w:t>
+            </w:r>
+          </w:p>
+        </w:tc>
+      </w:tr>
+      <w:tr>
+        <w:tc>
+          <w:tcPr>
+            <w:tcW w:type="dxa" w:w="4536"/>
+            <w:shd w:val="clear" w:color="auto" w:fill="EEF3F8"/>
+          </w:tcPr>
+          <w:p>
+            <w:r>
+              <w:rPr>
+                <w:rFonts w:ascii="Calibri" w:hAnsi="Calibri"/>
+                <w:color w:val="1A1A2E"/>
+                <w:sz w:val="20"/>
+              </w:rPr>
+              <w:t>Erste Datenmigration eEvolution</w:t>
+            </w:r>
+          </w:p>
+        </w:tc>
+        <w:tc>
+          <w:tcPr>
+            <w:tcW w:type="dxa" w:w="4536"/>
+          </w:tcPr>
+          <w:p>
+            <w:r>
+              <w:rPr>
+                <w:rFonts w:ascii="Calibri" w:hAnsi="Calibri"/>
+                <w:color w:val="1B7A47"/>
+                <w:sz w:val="20"/>
+              </w:rPr>
+              <w:t>Abgeschlossen</w:t>
+            </w:r>
+          </w:p>
+        </w:tc>
+      </w:tr>
+      <w:tr>
+        <w:tc>
+          <w:tcPr>
+            <w:tcW w:type="dxa" w:w="4536"/>
+            <w:shd w:val="clear" w:color="auto" w:fill="EEF3F8"/>
+          </w:tcPr>
+          <w:p>
+            <w:r>
+              <w:rPr>
+                <w:rFonts w:ascii="Calibri" w:hAnsi="Calibri"/>
+                <w:color w:val="C01050"/>
+                <w:sz w:val="20"/>
+              </w:rPr>
+              <w:t>Geplanter Go-live</w:t>
+            </w:r>
+          </w:p>
+        </w:tc>
+        <w:tc>
+          <w:tcPr>
+            <w:tcW w:type="dxa" w:w="4536"/>
+          </w:tcPr>
+          <w:p>
+            <w:r>
+              <w:rPr>
+                <w:rFonts w:ascii="Calibri" w:hAnsi="Calibri"/>
+                <w:color w:val="C01050"/>
+                <w:sz w:val="20"/>
+              </w:rPr>
+              <w:t>1. Oktober 2026</w:t>
             </w:r>
           </w:p>
         </w:tc>
@@ -1058,20 +1481,7 @@
     </w:tbl>
     <w:p>
       <w:pPr>
-        <w:spacing w:before="40" w:after="60"/>
-      </w:pPr>
-      <w:r>
-        <w:rPr>
-          <w:rFonts w:ascii="Calibri" w:hAnsi="Calibri"/>
-          <w:color w:val="1A1A2E"/>
-          <w:sz w:val="21"/>
-        </w:rPr>
-        <w:t>Einschätzung: Das System ist stabil und bewährt, aber technologisch veraltet. Fehlende Modernisierungspfade, eingeschränkte Integrationsfähigkeit und die hohen laufenden Kosten rechtfertigen die geplante Migration zu Odoo Enterprise 19.</w:t>
-      </w:r>
-    </w:p>
-    <w:p>
-      <w:pPr>
-        <w:spacing w:before="280" w:after="120"/>
+        <w:spacing w:before="200" w:after="80"/>
         <w:pBdr>
           <w:bottom w:val="single" w:sz="4" w:color="E85D04"/>
         </w:pBdr>
@@ -1083,7 +1493,7 @@
           <w:color w:val="E85D04"/>
           <w:sz w:val="26"/>
         </w:rPr>
-        <w:t>3.2 Serverinfrastruktur</w:t>
+        <w:t>3.3 Serverinfrastruktur</w:t>
       </w:r>
     </w:p>
     <w:tbl>
@@ -1134,7 +1544,7 @@
                 <w:color w:val="FFFFFF"/>
                 <w:sz w:val="20"/>
               </w:rPr>
-              <w:t>Funktion / Details</w:t>
+              <w:t>Funktion</w:t>
             </w:r>
           </w:p>
         </w:tc>
@@ -1340,7 +1750,7 @@
     </w:tbl>
     <w:p>
       <w:pPr>
-        <w:spacing w:before="280" w:after="120"/>
+        <w:spacing w:before="200" w:after="80"/>
         <w:pBdr>
           <w:bottom w:val="single" w:sz="4" w:color="E85D04"/>
         </w:pBdr>
@@ -1352,7 +1762,7 @@
           <w:color w:val="E85D04"/>
           <w:sz w:val="26"/>
         </w:rPr>
-        <w:t>3.3 Netzwerkinfrastruktur</w:t>
+        <w:t>3.4 Netzwerkinfrastruktur</w:t>
       </w:r>
     </w:p>
     <w:tbl>
@@ -1535,7 +1945,7 @@
                 <w:color w:val="1A1A2E"/>
                 <w:sz w:val="20"/>
               </w:rPr>
-              <w:t>VPN-Zugänge (Konzept in Überarbeitung)</w:t>
+              <w:t>VPN (Konzept in Überarbeitung)</w:t>
             </w:r>
           </w:p>
         </w:tc>
@@ -1553,7 +1963,7 @@
                 <w:color w:val="1A1A2E"/>
                 <w:sz w:val="20"/>
               </w:rPr>
-              <w:t>Backup-Strategie</w:t>
+              <w:t>Backup</w:t>
             </w:r>
           </w:p>
         </w:tc>
@@ -1568,7 +1978,7 @@
                 <w:color w:val="1A1A2E"/>
                 <w:sz w:val="20"/>
               </w:rPr>
-              <w:t>Täglich &amp; wöchentlich, Wiederherstellung mehrfach getestet</w:t>
+              <w:t>Täglich &amp; wöchentlich – Wiederherstellung mehrfach getestet</w:t>
             </w:r>
           </w:p>
         </w:tc>
@@ -1576,7 +1986,7 @@
     </w:tbl>
     <w:p>
       <w:pPr>
-        <w:spacing w:before="280" w:after="120"/>
+        <w:spacing w:before="200" w:after="80"/>
         <w:pBdr>
           <w:bottom w:val="single" w:sz="4" w:color="E85D04"/>
         </w:pBdr>
@@ -1588,12 +1998,14 @@
           <w:color w:val="E85D04"/>
           <w:sz w:val="26"/>
         </w:rPr>
-        <w:t>3.4 DMS – bitfarm-Archiv Enterprise</w:t>
+        <w:t>3.5 DMS – bitfarm-Archiv Enterprise 3.6.2</w:t>
       </w:r>
     </w:p>
     <w:p>
       <w:pPr>
-        <w:spacing w:before="40" w:after="60"/>
+        <w:pStyle w:val="ListBullet"/>
+        <w:spacing w:before="20" w:after="20"/>
+        <w:ind w:left="283"/>
       </w:pPr>
       <w:r>
         <w:rPr>
@@ -1601,12 +2013,57 @@
           <w:color w:val="1A1A2E"/>
           <w:sz w:val="21"/>
         </w:rPr>
-        <w:t>bitfarm-Archiv Enterprise 3.6.2 ist die eingesetzte Dokumentenmanagement-Plattform. Die Implementierung befindet sich im aktiven Aufbau. Kernziele sind strukturierte Archivierung mit OCR-Erkennung, automatischer Metadatenextraktion und Revisionssicherheit.</w:t>
+        <w:t>Strukturierte Archivierung mit OCR-Erkennung</w:t>
       </w:r>
     </w:p>
     <w:p>
       <w:pPr>
-        <w:spacing w:before="280" w:after="120"/>
+        <w:pStyle w:val="ListBullet"/>
+        <w:spacing w:before="20" w:after="20"/>
+        <w:ind w:left="283"/>
+      </w:pPr>
+      <w:r>
+        <w:rPr>
+          <w:rFonts w:ascii="Calibri" w:hAnsi="Calibri"/>
+          <w:color w:val="1A1A2E"/>
+          <w:sz w:val="21"/>
+        </w:rPr>
+        <w:t>Automatische Metadatenextraktion</w:t>
+      </w:r>
+    </w:p>
+    <w:p>
+      <w:pPr>
+        <w:pStyle w:val="ListBullet"/>
+        <w:spacing w:before="20" w:after="20"/>
+        <w:ind w:left="283"/>
+      </w:pPr>
+      <w:r>
+        <w:rPr>
+          <w:rFonts w:ascii="Calibri" w:hAnsi="Calibri"/>
+          <w:color w:val="1A1A2E"/>
+          <w:sz w:val="21"/>
+        </w:rPr>
+        <w:t>Fachbereichsbezogene Archivierung (Einkauf, Buchhaltung, Vertrieb, Personal, Technik, Produktion)</w:t>
+      </w:r>
+    </w:p>
+    <w:p>
+      <w:pPr>
+        <w:pStyle w:val="ListBullet"/>
+        <w:spacing w:before="20" w:after="20"/>
+        <w:ind w:left="283"/>
+      </w:pPr>
+      <w:r>
+        <w:rPr>
+          <w:rFonts w:ascii="Calibri" w:hAnsi="Calibri"/>
+          <w:color w:val="1A1A2E"/>
+          <w:sz w:val="21"/>
+        </w:rPr>
+        <w:t>Revisionssicherheit und Auffindbarkeit historischer Dokumente</w:t>
+      </w:r>
+    </w:p>
+    <w:p>
+      <w:pPr>
+        <w:spacing w:before="200" w:after="80"/>
         <w:pBdr>
           <w:bottom w:val="single" w:sz="4" w:color="E85D04"/>
         </w:pBdr>
@@ -1618,7 +2075,7 @@
           <w:color w:val="E85D04"/>
           <w:sz w:val="26"/>
         </w:rPr>
-        <w:t>3.5 KI-Infrastruktur (lokal)</w:t>
+        <w:t>3.6 KI-Infrastruktur (lokal, On-Premise)</w:t>
       </w:r>
     </w:p>
     <w:tbl>
@@ -1702,7 +2159,7 @@
                 <w:color w:val="1A1A2E"/>
                 <w:sz w:val="20"/>
               </w:rPr>
-              <w:t>Ollama (lokaler Betrieb, keine Cloud)</w:t>
+              <w:t>Ollama – vollständig lokal, keine Cloud</w:t>
             </w:r>
           </w:p>
         </w:tc>
@@ -1735,7 +2192,7 @@
                 <w:color w:val="1A1A2E"/>
                 <w:sz w:val="20"/>
               </w:rPr>
-              <w:t>qwen3:8b – für schnelle Klassifizierungsaufgaben</w:t>
+              <w:t>qwen3:8b – schnelle Klassifizierung</w:t>
             </w:r>
           </w:p>
         </w:tc>
@@ -1768,7 +2225,7 @@
                 <w:color w:val="1A1A2E"/>
                 <w:sz w:val="20"/>
               </w:rPr>
-              <w:t>qwen2.5:72b – für komplexe Analyse und Extraktion</w:t>
+              <w:t>qwen2.5:72b – komplexe Analyse &amp; Extraktion</w:t>
             </w:r>
           </w:p>
         </w:tc>
@@ -1798,10 +2255,10 @@
             <w:r>
               <w:rPr>
                 <w:rFonts w:ascii="Calibri" w:hAnsi="Calibri"/>
-                <w:color w:val="1A1A2E"/>
+                <w:color w:val="1B7A47"/>
                 <w:sz w:val="20"/>
               </w:rPr>
-              <w:t>NVIDIA RTX 4090 – in Planung</w:t>
+              <w:t>NVIDIA RTX 4090 – Läuft</w:t>
             </w:r>
           </w:p>
         </w:tc>
@@ -1819,7 +2276,7 @@
                 <w:color w:val="1A1A2E"/>
                 <w:sz w:val="20"/>
               </w:rPr>
-              <w:t>GPU (Test)</w:t>
+              <w:t>Grundprinzip</w:t>
             </w:r>
           </w:p>
         </w:tc>
@@ -1834,7 +2291,7 @@
                 <w:color w:val="1A1A2E"/>
                 <w:sz w:val="20"/>
               </w:rPr>
-              <w:t>NVIDIA RTX 3060 Ti – aktives Testsystem</w:t>
+              <w:t>Regeln zuerst – KI nur als kontrollierte Prüfinstanz</w:t>
             </w:r>
           </w:p>
         </w:tc>
@@ -1949,7 +2406,7 @@
                 <w:color w:val="1A1A2E"/>
                 <w:sz w:val="20"/>
               </w:rPr>
-              <w:t>Odoo Enterprise 19 Aufbau</w:t>
+              <w:t>Odoo Enterprise 19 – Aufbau</w:t>
             </w:r>
           </w:p>
         </w:tc>
@@ -1961,7 +2418,7 @@
             <w:r>
               <w:rPr>
                 <w:rFonts w:ascii="Calibri" w:hAnsi="Calibri"/>
-                <w:color w:val="1A1A2E"/>
+                <w:color w:val="0F3D6B"/>
                 <w:sz w:val="20"/>
               </w:rPr>
               <w:t>In Umsetzung</w:t>
@@ -1976,10 +2433,10 @@
             <w:r>
               <w:rPr>
                 <w:rFonts w:ascii="Calibri" w:hAnsi="Calibri"/>
-                <w:color w:val="1A1A2E"/>
+                <w:color w:val="C01050"/>
                 <w:sz w:val="20"/>
               </w:rPr>
-              <w:t>ERP-Ablösung eEvolution</w:t>
+              <w:t>ERP-Ablösung eEvolution – Go-live 1.10.2026</w:t>
             </w:r>
           </w:p>
         </w:tc>
@@ -1997,7 +2454,7 @@
                 <w:color w:val="1A1A2E"/>
                 <w:sz w:val="20"/>
               </w:rPr>
-              <w:t>Reverse-Proxy-Konzept</w:t>
+              <w:t>Datenmigration eEvolution → Odoo</w:t>
             </w:r>
           </w:p>
         </w:tc>
@@ -2009,10 +2466,10 @@
             <w:r>
               <w:rPr>
                 <w:rFonts w:ascii="Calibri" w:hAnsi="Calibri"/>
-                <w:color w:val="1A1A2E"/>
+                <w:color w:val="1B7A47"/>
                 <w:sz w:val="20"/>
               </w:rPr>
-              <w:t>In Planung</w:t>
+              <w:t>Erste Übernahme abgeschlossen</w:t>
             </w:r>
           </w:p>
         </w:tc>
@@ -2024,10 +2481,10 @@
             <w:r>
               <w:rPr>
                 <w:rFonts w:ascii="Calibri" w:hAnsi="Calibri"/>
-                <w:color w:val="1A1A2E"/>
+                <w:color w:val="C01050"/>
                 <w:sz w:val="20"/>
               </w:rPr>
-              <w:t>Sichere externe Erreichbarkeit</w:t>
+              <w:t>Vollständige Migration bis Go-live</w:t>
             </w:r>
           </w:p>
         </w:tc>
@@ -2045,7 +2502,22 @@
                 <w:color w:val="1A1A2E"/>
                 <w:sz w:val="20"/>
               </w:rPr>
-              <w:t>VPN-Konzept (Überarbeitung)</w:t>
+              <w:t>Reverse Proxy + HTTPS</w:t>
+            </w:r>
+          </w:p>
+        </w:tc>
+        <w:tc>
+          <w:tcPr>
+            <w:tcW w:type="dxa" w:w="3024"/>
+          </w:tcPr>
+          <w:p>
+            <w:r>
+              <w:rPr>
+                <w:rFonts w:ascii="Calibri" w:hAnsi="Calibri"/>
+                <w:color w:val="1B7A47"/>
+                <w:sz w:val="20"/>
+              </w:rPr>
+              <w:t>Läuft</w:t>
             </w:r>
           </w:p>
         </w:tc>
@@ -2058,6 +2530,87 @@
               <w:rPr>
                 <w:rFonts w:ascii="Calibri" w:hAnsi="Calibri"/>
                 <w:color w:val="1A1A2E"/>
+                <w:sz w:val="20"/>
+              </w:rPr>
+              <w:t>Sichere Erreichbarkeit Odoo</w:t>
+            </w:r>
+          </w:p>
+        </w:tc>
+      </w:tr>
+      <w:tr>
+        <w:tc>
+          <w:tcPr>
+            <w:tcW w:type="dxa" w:w="3024"/>
+            <w:shd w:val="clear" w:color="auto" w:fill="EEF3F8"/>
+          </w:tcPr>
+          <w:p>
+            <w:r>
+              <w:rPr>
+                <w:rFonts w:ascii="Calibri" w:hAnsi="Calibri"/>
+                <w:color w:val="1A1A2E"/>
+                <w:sz w:val="20"/>
+              </w:rPr>
+              <w:t>Subdomain auf Webserver</w:t>
+            </w:r>
+          </w:p>
+        </w:tc>
+        <w:tc>
+          <w:tcPr>
+            <w:tcW w:type="dxa" w:w="3024"/>
+          </w:tcPr>
+          <w:p>
+            <w:r>
+              <w:rPr>
+                <w:rFonts w:ascii="Calibri" w:hAnsi="Calibri"/>
+                <w:color w:val="B86E00"/>
+                <w:sz w:val="20"/>
+              </w:rPr>
+              <w:t>Ausstehend</w:t>
+            </w:r>
+          </w:p>
+        </w:tc>
+        <w:tc>
+          <w:tcPr>
+            <w:tcW w:type="dxa" w:w="3024"/>
+          </w:tcPr>
+          <w:p>
+            <w:r>
+              <w:rPr>
+                <w:rFonts w:ascii="Calibri" w:hAnsi="Calibri"/>
+                <w:color w:val="B86E00"/>
+                <w:sz w:val="20"/>
+              </w:rPr>
+              <w:t>Letzter offener Punkt für Odoo-Zugang</w:t>
+            </w:r>
+          </w:p>
+        </w:tc>
+      </w:tr>
+      <w:tr>
+        <w:tc>
+          <w:tcPr>
+            <w:tcW w:type="dxa" w:w="3024"/>
+            <w:shd w:val="clear" w:color="auto" w:fill="EEF3F8"/>
+          </w:tcPr>
+          <w:p>
+            <w:r>
+              <w:rPr>
+                <w:rFonts w:ascii="Calibri" w:hAnsi="Calibri"/>
+                <w:color w:val="1A1A2E"/>
+                <w:sz w:val="20"/>
+              </w:rPr>
+              <w:t>VPN-Konzept</w:t>
+            </w:r>
+          </w:p>
+        </w:tc>
+        <w:tc>
+          <w:tcPr>
+            <w:tcW w:type="dxa" w:w="3024"/>
+          </w:tcPr>
+          <w:p>
+            <w:r>
+              <w:rPr>
+                <w:rFonts w:ascii="Calibri" w:hAnsi="Calibri"/>
+                <w:color w:val="B86E00"/>
                 <w:sz w:val="20"/>
               </w:rPr>
               <w:t>In Planung</w:t>
@@ -2105,7 +2658,7 @@
             <w:r>
               <w:rPr>
                 <w:rFonts w:ascii="Calibri" w:hAnsi="Calibri"/>
-                <w:color w:val="1A1A2E"/>
+                <w:color w:val="0F3D6B"/>
                 <w:sz w:val="20"/>
               </w:rPr>
               <w:t>In Entwicklung</w:t>
@@ -2123,7 +2676,7 @@
                 <w:color w:val="1A1A2E"/>
                 <w:sz w:val="20"/>
               </w:rPr>
-              <w:t>Fileserver → DMS-Migration</w:t>
+              <w:t>Fileserver → OCR → KI → DMS</w:t>
             </w:r>
           </w:p>
         </w:tc>
@@ -2153,7 +2706,7 @@
             <w:r>
               <w:rPr>
                 <w:rFonts w:ascii="Calibri" w:hAnsi="Calibri"/>
-                <w:color w:val="1A1A2E"/>
+                <w:color w:val="0F3D6B"/>
                 <w:sz w:val="20"/>
               </w:rPr>
               <w:t>In Aufbau</w:t>
@@ -2201,7 +2754,7 @@
             <w:r>
               <w:rPr>
                 <w:rFonts w:ascii="Calibri" w:hAnsi="Calibri"/>
-                <w:color w:val="1A1A2E"/>
+                <w:color w:val="0F3D6B"/>
                 <w:sz w:val="20"/>
               </w:rPr>
               <w:t>In Entwicklung</w:t>
@@ -2345,7 +2898,7 @@
             <w:r>
               <w:rPr>
                 <w:rFonts w:ascii="Calibri" w:hAnsi="Calibri"/>
-                <w:color w:val="1A1A2E"/>
+                <w:color w:val="0F3D6B"/>
                 <w:sz w:val="20"/>
               </w:rPr>
               <w:t>In Arbeit</w:t>
@@ -2372,7 +2925,7 @@
     <w:p/>
     <w:p>
       <w:pPr>
-        <w:spacing w:before="280" w:after="120"/>
+        <w:spacing w:before="200" w:after="80"/>
         <w:pBdr>
           <w:bottom w:val="single" w:sz="4" w:color="E85D04"/>
         </w:pBdr>
@@ -2397,7 +2950,7 @@
           <w:color w:val="1A1A2E"/>
           <w:sz w:val="21"/>
         </w:rPr>
-        <w:t>Der Dokumententrichter ist eine eigenentwickelte Softwareplattform, die den gesamten Prozess von der Fileserver-Quelle bis zum DMS-Import orchestriert. Er bildet das zentrale Nervensystem der Dokumentendigitalisierung bei Kling &amp; Freitag.</w:t>
+        <w:t>Der Dokumententrichter ist eine eigenentwickelte Plattform, die den vollständigen Prozess von der Fileserver-Quelle bis zum DMS-Import orchestriert – das zentrale Nervensystem der Dokumentendigitalisierung bei Kling &amp; Freitag.</w:t>
       </w:r>
     </w:p>
     <w:tbl>
@@ -2613,7 +3166,7 @@
                 <w:color w:val="1A1A2E"/>
                 <w:sz w:val="20"/>
               </w:rPr>
-              <w:t>Benutzeroberfläche für Operatoren und Prüffälle</w:t>
+              <w:t>Benutzeroberfläche für Operatoren</w:t>
             </w:r>
           </w:p>
         </w:tc>
@@ -2653,19 +3206,6 @@
       </w:tr>
     </w:tbl>
     <w:p>
-      <w:pPr>
-        <w:spacing w:before="40" w:after="60"/>
-      </w:pPr>
-      <w:r>
-        <w:rPr>
-          <w:rFonts w:ascii="Calibri" w:hAnsi="Calibri"/>
-          <w:color w:val="1A1A2E"/>
-          <w:sz w:val="21"/>
-        </w:rPr>
-        <w:t>Unterstützte Fachbereiche: Einkauf · Buchhaltung · Vertrieb · Personal · Technik · Produktion</w:t>
-      </w:r>
-    </w:p>
-    <w:p>
       <w:r>
         <w:br w:type="page"/>
       </w:r>
@@ -2689,7 +3229,7 @@
     </w:p>
     <w:p>
       <w:pPr>
-        <w:spacing w:before="280" w:after="120"/>
+        <w:spacing w:before="200" w:after="80"/>
         <w:pBdr>
           <w:bottom w:val="single" w:sz="4" w:color="E85D04"/>
         </w:pBdr>
@@ -2702,19 +3242,6 @@
           <w:sz w:val="26"/>
         </w:rPr>
         <w:t>5.1 Strategische Leitprinzipien</w:t>
-      </w:r>
-    </w:p>
-    <w:p>
-      <w:pPr>
-        <w:spacing w:before="40" w:after="60"/>
-      </w:pPr>
-      <w:r>
-        <w:rPr>
-          <w:rFonts w:ascii="Calibri" w:hAnsi="Calibri"/>
-          <w:color w:val="1A1A2E"/>
-          <w:sz w:val="21"/>
-        </w:rPr>
-        <w:t>Die IT-Strategie von Kling &amp; Freitag folgt vier übergeordneten Prinzipien, die alle Investitions- und Architekturentscheidungen leiten:</w:t>
       </w:r>
     </w:p>
     <w:p>
@@ -2737,7 +3264,7 @@
           <w:color w:val="1A1A2E"/>
           <w:sz w:val="21"/>
         </w:rPr>
-        <w:t>Alle Kernsysteme werden auf eigener Infrastruktur betrieben. Dies gewährleistet maximalen Datenschutz (DSGVO), Kostenkontrolle und Unabhängigkeit von externen Anbietern.</w:t>
+        <w:t>Alle Kernsysteme laufen auf eigener Infrastruktur – maximaler Datenschutz (DSGVO), Kostenkontrolle, Unabhängigkeit.</w:t>
       </w:r>
     </w:p>
     <w:p>
@@ -2760,7 +3287,7 @@
           <w:color w:val="1A1A2E"/>
           <w:sz w:val="21"/>
         </w:rPr>
-        <w:t>Integrationen und Anpassungen werden so gestaltet, dass Standard-Updates der Kernsysteme nicht blockiert werden. Wo möglich werden offizielle APIs und Standard-Module genutzt.</w:t>
+        <w:t>Integrationen werden so gestaltet, dass Standard-Updates der Kernsysteme nicht blockiert werden.</w:t>
       </w:r>
     </w:p>
     <w:p>
@@ -2783,7 +3310,7 @@
           <w:color w:val="1A1A2E"/>
           <w:sz w:val="21"/>
         </w:rPr>
-        <w:t>KI-Systeme agieren als kontrollierte Prüfinstanz, nicht als primäre Entscheidungslogik. Regelbasierte Systeme bilden die Grundschicht; KI ergänzt und validiert.</w:t>
+        <w:t>KI agiert als kontrollierte Prüfinstanz, nicht als primäre Entscheidungslogik. Regelbasierte Systeme bilden die Grundschicht.</w:t>
       </w:r>
     </w:p>
     <w:p>
@@ -2806,12 +3333,12 @@
           <w:color w:val="1A1A2E"/>
           <w:sz w:val="21"/>
         </w:rPr>
-        <w:t>Alle Eigenentwicklungen werden dokumentiert, modular aufgebaut und mit Fokus auf Übergabe- und Wartbarkeit gestaltet.</w:t>
+        <w:t>Alle Eigenentwicklungen werden vollständig dokumentiert, modular aufgebaut und auf Übergabe ausgelegt.</w:t>
       </w:r>
     </w:p>
     <w:p>
       <w:pPr>
-        <w:spacing w:before="280" w:after="120"/>
+        <w:spacing w:before="200" w:after="80"/>
         <w:pBdr>
           <w:bottom w:val="single" w:sz="4" w:color="E85D04"/>
         </w:pBdr>
@@ -2824,19 +3351,6 @@
           <w:sz w:val="26"/>
         </w:rPr>
         <w:t>5.2 Zielarchitektur 2027+</w:t>
-      </w:r>
-    </w:p>
-    <w:p>
-      <w:pPr>
-        <w:spacing w:before="40" w:after="60"/>
-      </w:pPr>
-      <w:r>
-        <w:rPr>
-          <w:rFonts w:ascii="Calibri" w:hAnsi="Calibri"/>
-          <w:color w:val="1A1A2E"/>
-          <w:sz w:val="21"/>
-        </w:rPr>
-        <w:t>Das Zielbild ist eine vollständig integrierte, lokale Unternehmensplattform, die alle Geschäftsprozesse digital abbildet und miteinander verbindet:</w:t>
       </w:r>
     </w:p>
     <w:tbl>
@@ -2953,7 +3467,7 @@
             <w:r>
               <w:rPr>
                 <w:rFonts w:ascii="Calibri" w:hAnsi="Calibri"/>
-                <w:color w:val="1A1A2E"/>
+                <w:color w:val="1B7A47"/>
                 <w:sz w:val="20"/>
               </w:rPr>
               <w:t>CRM, Einkauf, Verkauf, Lager, Fertigung, Buchhaltung, Reporting</w:t>
@@ -3052,7 +3566,7 @@
                 <w:color w:val="1A1A2E"/>
                 <w:sz w:val="20"/>
               </w:rPr>
-              <w:t>Klassifizierung, Extraktion, Analyse – vollständig On-Premise</w:t>
+              <w:t>Klassifizierung, Extraktion, Analyse – On-Premise, RTX 4090</w:t>
             </w:r>
           </w:p>
         </w:tc>
@@ -3204,7 +3718,7 @@
     </w:tbl>
     <w:p>
       <w:pPr>
-        <w:spacing w:before="280" w:after="120"/>
+        <w:spacing w:before="200" w:after="80"/>
         <w:pBdr>
           <w:bottom w:val="single" w:sz="4" w:color="E85D04"/>
         </w:pBdr>
@@ -3216,7 +3730,7 @@
           <w:color w:val="E85D04"/>
           <w:sz w:val="26"/>
         </w:rPr>
-        <w:t>5.3 Phasenplan</w:t>
+        <w:t>5.3 Phasenplan mit Meilensteinen</w:t>
       </w:r>
     </w:p>
     <w:p>
@@ -3227,10 +3741,10 @@
         <w:rPr>
           <w:rFonts w:ascii="Calibri" w:hAnsi="Calibri"/>
           <w:b/>
-          <w:color w:val="0F3D6B"/>
+          <w:color w:val="C01050"/>
           <w:sz w:val="22"/>
         </w:rPr>
-        <w:t>Phase 1 – Fundament (2026)</w:t>
+        <w:t>Phase 1 – Fundament &amp; Go-live (bis 1. Oktober 2026)</w:t>
       </w:r>
     </w:p>
     <w:p>
@@ -3245,7 +3759,7 @@
           <w:color w:val="1A1A2E"/>
           <w:sz w:val="21"/>
         </w:rPr>
-        <w:t>Fertigstellung Odoo-Server (Reverse Proxy, HTTPS, VPN)</w:t>
+        <w:t>Subdomain einrichten → Odoo extern erreichbar</w:t>
       </w:r>
     </w:p>
     <w:p>
@@ -3260,7 +3774,7 @@
           <w:color w:val="1A1A2E"/>
           <w:sz w:val="21"/>
         </w:rPr>
-        <w:t>bitfarm DMS: Basiskonfiguration &amp; erste Fachbereiche produktiv</w:t>
+        <w:t>VPN-Zugriff finalisieren</w:t>
       </w:r>
     </w:p>
     <w:p>
@@ -3275,7 +3789,7 @@
           <w:color w:val="1A1A2E"/>
           <w:sz w:val="21"/>
         </w:rPr>
-        <w:t>Dokumententrichter: Pilotbetrieb mit Fachbereich Einkauf/Buchhaltung</w:t>
+        <w:t>Vollständige Datenmigration eEvolution → Odoo abschließen</w:t>
       </w:r>
     </w:p>
     <w:p>
@@ -3290,7 +3804,7 @@
           <w:color w:val="1A1A2E"/>
           <w:sz w:val="21"/>
         </w:rPr>
-        <w:t>Netzwerk- &amp; Infrastrukturdokumentation abgeschlossen</w:t>
+        <w:t>GO-LIVE Odoo Enterprise 19: 1. Oktober 2026</w:t>
       </w:r>
     </w:p>
     <w:p>
@@ -3305,21 +3819,7 @@
           <w:color w:val="1A1A2E"/>
           <w:sz w:val="21"/>
         </w:rPr>
-        <w:t>KI: RTX 4090 beschafft, qwen2.5:72b im Produktiveinsatz</w:t>
-      </w:r>
-    </w:p>
-    <w:p>
-      <w:pPr>
-        <w:spacing w:before="160" w:after="40"/>
-      </w:pPr>
-      <w:r>
-        <w:rPr>
-          <w:rFonts w:ascii="Calibri" w:hAnsi="Calibri"/>
-          <w:b/>
-          <w:color w:val="0F3D6B"/>
-          <w:sz w:val="22"/>
-        </w:rPr>
-        <w:t>Phase 2 – Integration (2026–2027)</w:t>
+        <w:t>bitfarm DMS: erste Fachbereiche produktiv</w:t>
       </w:r>
     </w:p>
     <w:p>
@@ -3334,7 +3834,21 @@
           <w:color w:val="1A1A2E"/>
           <w:sz w:val="21"/>
         </w:rPr>
-        <w:t>Odoo: Einkauf, Verkauf, Lager, Fertigung live</w:t>
+        <w:t>Dokumententrichter: Pilotbetrieb Einkauf/Buchhaltung</w:t>
+      </w:r>
+    </w:p>
+    <w:p>
+      <w:pPr>
+        <w:spacing w:before="160" w:after="40"/>
+      </w:pPr>
+      <w:r>
+        <w:rPr>
+          <w:rFonts w:ascii="Calibri" w:hAnsi="Calibri"/>
+          <w:b/>
+          <w:color w:val="0F3D6B"/>
+          <w:sz w:val="22"/>
+        </w:rPr>
+        <w:t>Phase 2 – Integration &amp; Ablösung (Q4 2026 – 2027)</w:t>
       </w:r>
     </w:p>
     <w:p>
@@ -3349,7 +3863,7 @@
           <w:color w:val="1A1A2E"/>
           <w:sz w:val="21"/>
         </w:rPr>
-        <w:t>ERP-Migration: Datenmigration eEvolution → Odoo</w:t>
+        <w:t>Alle Odoo-Module live (Einkauf, Verkauf, Lager, Fertigung, Buchhaltung)</w:t>
       </w:r>
     </w:p>
     <w:p>
@@ -3364,7 +3878,7 @@
           <w:color w:val="1A1A2E"/>
           <w:sz w:val="21"/>
         </w:rPr>
-        <w:t>bitfarm–Odoo-Integration: Dokumente verknüpft mit ERP-Objekten</w:t>
+        <w:t>bitfarm–Odoo-Integration: Dokumente direkt mit ERP-Objekten verknüpft</w:t>
       </w:r>
     </w:p>
     <w:p>
@@ -3409,7 +3923,7 @@
           <w:color w:val="1A1A2E"/>
           <w:sz w:val="21"/>
         </w:rPr>
-        <w:t>Abschaltung eEvolution (Meilenstein: Kostenentlastung ~42.000 €/Jahr)</w:t>
+        <w:t>Abschaltung eEvolution → Einsparung ~42.000 €/Jahr</w:t>
       </w:r>
     </w:p>
     <w:p>
@@ -3423,7 +3937,7 @@
           <w:color w:val="0F3D6B"/>
           <w:sz w:val="22"/>
         </w:rPr>
-        <w:t>Phase 3 – Optimierung &amp; KI (2027+)</w:t>
+        <w:t>Phase 3 – KI-Ausbau &amp; Optimierung (2027+)</w:t>
       </w:r>
     </w:p>
     <w:p>
@@ -3468,7 +3982,7 @@
           <w:color w:val="1A1A2E"/>
           <w:sz w:val="21"/>
         </w:rPr>
-        <w:t>BI &amp; Reporting-Dashboards auf Odoo-Basis</w:t>
+        <w:t>BI &amp; Reporting-Dashboards</w:t>
       </w:r>
     </w:p>
     <w:p>
@@ -3502,21 +4016,6 @@
       </w:r>
     </w:p>
     <w:p>
-      <w:pPr>
-        <w:pStyle w:val="ListBullet"/>
-        <w:spacing w:before="20" w:after="20"/>
-        <w:ind w:left="283"/>
-      </w:pPr>
-      <w:r>
-        <w:rPr>
-          <w:rFonts w:ascii="Calibri" w:hAnsi="Calibri"/>
-          <w:color w:val="1A1A2E"/>
-          <w:sz w:val="21"/>
-        </w:rPr>
-        <w:t>Wissensmanagement-System auf KI-Basis</w:t>
-      </w:r>
-    </w:p>
-    <w:p>
       <w:r>
         <w:br w:type="page"/>
       </w:r>
@@ -3540,7 +4039,7 @@
     </w:p>
     <w:p>
       <w:pPr>
-        <w:spacing w:before="280" w:after="120"/>
+        <w:spacing w:before="200" w:after="80"/>
         <w:pBdr>
           <w:bottom w:val="single" w:sz="4" w:color="E85D04"/>
         </w:pBdr>
@@ -3552,7 +4051,7 @@
           <w:color w:val="E85D04"/>
           <w:sz w:val="26"/>
         </w:rPr>
-        <w:t>6.1 Systemkonfiguration (Ziel)</w:t>
+        <w:t>6.1 Systemkonfiguration</w:t>
       </w:r>
     </w:p>
     <w:tbl>
@@ -3603,7 +4102,7 @@
                 <w:color w:val="FFFFFF"/>
                 <w:sz w:val="20"/>
               </w:rPr>
-              <w:t>Wert</w:t>
+              <w:t>Wert / Status</w:t>
             </w:r>
           </w:p>
         </w:tc>
@@ -3783,7 +4282,7 @@
             <w:r>
               <w:rPr>
                 <w:rFonts w:ascii="Calibri" w:hAnsi="Calibri"/>
-                <w:color w:val="1A1A2E"/>
+                <w:color w:val="1B7A47"/>
                 <w:sz w:val="20"/>
               </w:rPr>
               <w:t>Produktivdatenbank</w:t>
@@ -3819,7 +4318,7 @@
                 <w:color w:val="1A1A2E"/>
                 <w:sz w:val="20"/>
               </w:rPr>
-              <w:t>Zugang</w:t>
+              <w:t>Reverse Proxy + HTTPS</w:t>
             </w:r>
           </w:p>
         </w:tc>
@@ -3831,10 +4330,109 @@
             <w:r>
               <w:rPr>
                 <w:rFonts w:ascii="Calibri" w:hAnsi="Calibri"/>
+                <w:color w:val="1B7A47"/>
+                <w:sz w:val="20"/>
+              </w:rPr>
+              <w:t>Läuft</w:t>
+            </w:r>
+          </w:p>
+        </w:tc>
+      </w:tr>
+      <w:tr>
+        <w:tc>
+          <w:tcPr>
+            <w:tcW w:type="dxa" w:w="4536"/>
+            <w:shd w:val="clear" w:color="auto" w:fill="EEF3F8"/>
+          </w:tcPr>
+          <w:p>
+            <w:r>
+              <w:rPr>
+                <w:rFonts w:ascii="Calibri" w:hAnsi="Calibri"/>
                 <w:color w:val="1A1A2E"/>
                 <w:sz w:val="20"/>
               </w:rPr>
-              <w:t>HTTPS via Reverse Proxy + VPN</w:t>
+              <w:t>Subdomain</w:t>
+            </w:r>
+          </w:p>
+        </w:tc>
+        <w:tc>
+          <w:tcPr>
+            <w:tcW w:type="dxa" w:w="4536"/>
+          </w:tcPr>
+          <w:p>
+            <w:r>
+              <w:rPr>
+                <w:rFonts w:ascii="Calibri" w:hAnsi="Calibri"/>
+                <w:color w:val="B86E00"/>
+                <w:sz w:val="20"/>
+              </w:rPr>
+              <w:t>Ausstehend</w:t>
+            </w:r>
+          </w:p>
+        </w:tc>
+      </w:tr>
+      <w:tr>
+        <w:tc>
+          <w:tcPr>
+            <w:tcW w:type="dxa" w:w="4536"/>
+            <w:shd w:val="clear" w:color="auto" w:fill="EEF3F8"/>
+          </w:tcPr>
+          <w:p>
+            <w:r>
+              <w:rPr>
+                <w:rFonts w:ascii="Calibri" w:hAnsi="Calibri"/>
+                <w:color w:val="1A1A2E"/>
+                <w:sz w:val="20"/>
+              </w:rPr>
+              <w:t>VPN-Zugriff</w:t>
+            </w:r>
+          </w:p>
+        </w:tc>
+        <w:tc>
+          <w:tcPr>
+            <w:tcW w:type="dxa" w:w="4536"/>
+          </w:tcPr>
+          <w:p>
+            <w:r>
+              <w:rPr>
+                <w:rFonts w:ascii="Calibri" w:hAnsi="Calibri"/>
+                <w:color w:val="B86E00"/>
+                <w:sz w:val="20"/>
+              </w:rPr>
+              <w:t>In Planung</w:t>
+            </w:r>
+          </w:p>
+        </w:tc>
+      </w:tr>
+      <w:tr>
+        <w:tc>
+          <w:tcPr>
+            <w:tcW w:type="dxa" w:w="4536"/>
+            <w:shd w:val="clear" w:color="auto" w:fill="EEF3F8"/>
+          </w:tcPr>
+          <w:p>
+            <w:r>
+              <w:rPr>
+                <w:rFonts w:ascii="Calibri" w:hAnsi="Calibri"/>
+                <w:color w:val="C01050"/>
+                <w:sz w:val="20"/>
+              </w:rPr>
+              <w:t>Geplanter Go-live</w:t>
+            </w:r>
+          </w:p>
+        </w:tc>
+        <w:tc>
+          <w:tcPr>
+            <w:tcW w:type="dxa" w:w="4536"/>
+          </w:tcPr>
+          <w:p>
+            <w:r>
+              <w:rPr>
+                <w:rFonts w:ascii="Calibri" w:hAnsi="Calibri"/>
+                <w:color w:val="C01050"/>
+                <w:sz w:val="20"/>
+              </w:rPr>
+              <w:t>1. Oktober 2026</w:t>
             </w:r>
           </w:p>
         </w:tc>
@@ -3842,7 +4440,7 @@
     </w:tbl>
     <w:p>
       <w:pPr>
-        <w:spacing w:before="280" w:after="120"/>
+        <w:spacing w:before="200" w:after="80"/>
         <w:pBdr>
           <w:bottom w:val="single" w:sz="4" w:color="E85D04"/>
         </w:pBdr>
@@ -3854,7 +4452,375 @@
           <w:color w:val="E85D04"/>
           <w:sz w:val="26"/>
         </w:rPr>
-        <w:t>6.2 Geplante Module</w:t>
+        <w:t>6.2 Migrationsstatus</w:t>
+      </w:r>
+    </w:p>
+    <w:tbl>
+      <w:tblPr>
+        <w:tblStyle w:val="TableGrid"/>
+        <w:tblW w:type="auto" w:w="0"/>
+        <w:jc w:val="center"/>
+        <w:tblLook w:firstColumn="1" w:firstRow="1" w:lastColumn="0" w:lastRow="0" w:noHBand="0" w:noVBand="1" w:val="04A0"/>
+      </w:tblPr>
+      <w:tblGrid>
+        <w:gridCol w:w="4536"/>
+        <w:gridCol w:w="4536"/>
+      </w:tblGrid>
+      <w:tr>
+        <w:tc>
+          <w:tcPr>
+            <w:tcW w:type="dxa" w:w="4536"/>
+            <w:shd w:val="clear" w:color="auto" w:fill="0F3D6B"/>
+          </w:tcPr>
+          <w:p>
+            <w:pPr>
+              <w:jc w:val="center"/>
+            </w:pPr>
+            <w:r>
+              <w:rPr>
+                <w:rFonts w:ascii="Calibri" w:hAnsi="Calibri"/>
+                <w:b/>
+                <w:color w:val="FFFFFF"/>
+                <w:sz w:val="20"/>
+              </w:rPr>
+              <w:t>Aufgabe</w:t>
+            </w:r>
+          </w:p>
+        </w:tc>
+        <w:tc>
+          <w:tcPr>
+            <w:tcW w:type="dxa" w:w="4536"/>
+            <w:shd w:val="clear" w:color="auto" w:fill="0F3D6B"/>
+          </w:tcPr>
+          <w:p>
+            <w:pPr>
+              <w:jc w:val="center"/>
+            </w:pPr>
+            <w:r>
+              <w:rPr>
+                <w:rFonts w:ascii="Calibri" w:hAnsi="Calibri"/>
+                <w:b/>
+                <w:color w:val="FFFFFF"/>
+                <w:sz w:val="20"/>
+              </w:rPr>
+              <w:t>Status</w:t>
+            </w:r>
+          </w:p>
+        </w:tc>
+      </w:tr>
+      <w:tr>
+        <w:tc>
+          <w:tcPr>
+            <w:tcW w:type="dxa" w:w="4536"/>
+            <w:shd w:val="clear" w:color="auto" w:fill="EEF3F8"/>
+          </w:tcPr>
+          <w:p>
+            <w:r>
+              <w:rPr>
+                <w:rFonts w:ascii="Calibri" w:hAnsi="Calibri"/>
+                <w:color w:val="1A1A2E"/>
+                <w:sz w:val="20"/>
+              </w:rPr>
+              <w:t>Systemaufbau (VM, OS, PostgreSQL)</w:t>
+            </w:r>
+          </w:p>
+        </w:tc>
+        <w:tc>
+          <w:tcPr>
+            <w:tcW w:type="dxa" w:w="4536"/>
+          </w:tcPr>
+          <w:p>
+            <w:r>
+              <w:rPr>
+                <w:rFonts w:ascii="Calibri" w:hAnsi="Calibri"/>
+                <w:color w:val="1B7A47"/>
+                <w:sz w:val="20"/>
+              </w:rPr>
+              <w:t>Abgeschlossen</w:t>
+            </w:r>
+          </w:p>
+        </w:tc>
+      </w:tr>
+      <w:tr>
+        <w:tc>
+          <w:tcPr>
+            <w:tcW w:type="dxa" w:w="4536"/>
+            <w:shd w:val="clear" w:color="auto" w:fill="EEF3F8"/>
+          </w:tcPr>
+          <w:p>
+            <w:r>
+              <w:rPr>
+                <w:rFonts w:ascii="Calibri" w:hAnsi="Calibri"/>
+                <w:color w:val="1A1A2E"/>
+                <w:sz w:val="20"/>
+              </w:rPr>
+              <w:t>Odoo 19 Installation</w:t>
+            </w:r>
+          </w:p>
+        </w:tc>
+        <w:tc>
+          <w:tcPr>
+            <w:tcW w:type="dxa" w:w="4536"/>
+          </w:tcPr>
+          <w:p>
+            <w:r>
+              <w:rPr>
+                <w:rFonts w:ascii="Calibri" w:hAnsi="Calibri"/>
+                <w:color w:val="1B7A47"/>
+                <w:sz w:val="20"/>
+              </w:rPr>
+              <w:t>Abgeschlossen</w:t>
+            </w:r>
+          </w:p>
+        </w:tc>
+      </w:tr>
+      <w:tr>
+        <w:tc>
+          <w:tcPr>
+            <w:tcW w:type="dxa" w:w="4536"/>
+            <w:shd w:val="clear" w:color="auto" w:fill="EEF3F8"/>
+          </w:tcPr>
+          <w:p>
+            <w:r>
+              <w:rPr>
+                <w:rFonts w:ascii="Calibri" w:hAnsi="Calibri"/>
+                <w:color w:val="1A1A2E"/>
+                <w:sz w:val="20"/>
+              </w:rPr>
+              <w:t>Reverse Proxy + HTTPS</w:t>
+            </w:r>
+          </w:p>
+        </w:tc>
+        <w:tc>
+          <w:tcPr>
+            <w:tcW w:type="dxa" w:w="4536"/>
+          </w:tcPr>
+          <w:p>
+            <w:r>
+              <w:rPr>
+                <w:rFonts w:ascii="Calibri" w:hAnsi="Calibri"/>
+                <w:color w:val="1B7A47"/>
+                <w:sz w:val="20"/>
+              </w:rPr>
+              <w:t>Läuft</w:t>
+            </w:r>
+          </w:p>
+        </w:tc>
+      </w:tr>
+      <w:tr>
+        <w:tc>
+          <w:tcPr>
+            <w:tcW w:type="dxa" w:w="4536"/>
+            <w:shd w:val="clear" w:color="auto" w:fill="EEF3F8"/>
+          </w:tcPr>
+          <w:p>
+            <w:r>
+              <w:rPr>
+                <w:rFonts w:ascii="Calibri" w:hAnsi="Calibri"/>
+                <w:color w:val="1A1A2E"/>
+                <w:sz w:val="20"/>
+              </w:rPr>
+              <w:t>Subdomain-Konfiguration Webserver</w:t>
+            </w:r>
+          </w:p>
+        </w:tc>
+        <w:tc>
+          <w:tcPr>
+            <w:tcW w:type="dxa" w:w="4536"/>
+          </w:tcPr>
+          <w:p>
+            <w:r>
+              <w:rPr>
+                <w:rFonts w:ascii="Calibri" w:hAnsi="Calibri"/>
+                <w:color w:val="B86E00"/>
+                <w:sz w:val="20"/>
+              </w:rPr>
+              <w:t>Ausstehend</w:t>
+            </w:r>
+          </w:p>
+        </w:tc>
+      </w:tr>
+      <w:tr>
+        <w:tc>
+          <w:tcPr>
+            <w:tcW w:type="dxa" w:w="4536"/>
+            <w:shd w:val="clear" w:color="auto" w:fill="EEF3F8"/>
+          </w:tcPr>
+          <w:p>
+            <w:r>
+              <w:rPr>
+                <w:rFonts w:ascii="Calibri" w:hAnsi="Calibri"/>
+                <w:color w:val="1A1A2E"/>
+                <w:sz w:val="20"/>
+              </w:rPr>
+              <w:t>Erste Datenübernahme aus eEvolution</w:t>
+            </w:r>
+          </w:p>
+        </w:tc>
+        <w:tc>
+          <w:tcPr>
+            <w:tcW w:type="dxa" w:w="4536"/>
+          </w:tcPr>
+          <w:p>
+            <w:r>
+              <w:rPr>
+                <w:rFonts w:ascii="Calibri" w:hAnsi="Calibri"/>
+                <w:color w:val="1B7A47"/>
+                <w:sz w:val="20"/>
+              </w:rPr>
+              <w:t>Abgeschlossen</w:t>
+            </w:r>
+          </w:p>
+        </w:tc>
+      </w:tr>
+      <w:tr>
+        <w:tc>
+          <w:tcPr>
+            <w:tcW w:type="dxa" w:w="4536"/>
+            <w:shd w:val="clear" w:color="auto" w:fill="EEF3F8"/>
+          </w:tcPr>
+          <w:p>
+            <w:r>
+              <w:rPr>
+                <w:rFonts w:ascii="Calibri" w:hAnsi="Calibri"/>
+                <w:color w:val="1A1A2E"/>
+                <w:sz w:val="20"/>
+              </w:rPr>
+              <w:t>Vollständige Datenmigration</w:t>
+            </w:r>
+          </w:p>
+        </w:tc>
+        <w:tc>
+          <w:tcPr>
+            <w:tcW w:type="dxa" w:w="4536"/>
+          </w:tcPr>
+          <w:p>
+            <w:r>
+              <w:rPr>
+                <w:rFonts w:ascii="Calibri" w:hAnsi="Calibri"/>
+                <w:color w:val="0F3D6B"/>
+                <w:sz w:val="20"/>
+              </w:rPr>
+              <w:t>In Arbeit</w:t>
+            </w:r>
+          </w:p>
+        </w:tc>
+      </w:tr>
+      <w:tr>
+        <w:tc>
+          <w:tcPr>
+            <w:tcW w:type="dxa" w:w="4536"/>
+            <w:shd w:val="clear" w:color="auto" w:fill="EEF3F8"/>
+          </w:tcPr>
+          <w:p>
+            <w:r>
+              <w:rPr>
+                <w:rFonts w:ascii="Calibri" w:hAnsi="Calibri"/>
+                <w:color w:val="1A1A2E"/>
+                <w:sz w:val="20"/>
+              </w:rPr>
+              <w:t>Modulkonfiguration &amp; Customizing</w:t>
+            </w:r>
+          </w:p>
+        </w:tc>
+        <w:tc>
+          <w:tcPr>
+            <w:tcW w:type="dxa" w:w="4536"/>
+          </w:tcPr>
+          <w:p>
+            <w:r>
+              <w:rPr>
+                <w:rFonts w:ascii="Calibri" w:hAnsi="Calibri"/>
+                <w:color w:val="0F3D6B"/>
+                <w:sz w:val="20"/>
+              </w:rPr>
+              <w:t>In Arbeit</w:t>
+            </w:r>
+          </w:p>
+        </w:tc>
+      </w:tr>
+      <w:tr>
+        <w:tc>
+          <w:tcPr>
+            <w:tcW w:type="dxa" w:w="4536"/>
+            <w:shd w:val="clear" w:color="auto" w:fill="EEF3F8"/>
+          </w:tcPr>
+          <w:p>
+            <w:r>
+              <w:rPr>
+                <w:rFonts w:ascii="Calibri" w:hAnsi="Calibri"/>
+                <w:color w:val="1A1A2E"/>
+                <w:sz w:val="20"/>
+              </w:rPr>
+              <w:t>User-Schulung</w:t>
+            </w:r>
+          </w:p>
+        </w:tc>
+        <w:tc>
+          <w:tcPr>
+            <w:tcW w:type="dxa" w:w="4536"/>
+          </w:tcPr>
+          <w:p>
+            <w:r>
+              <w:rPr>
+                <w:rFonts w:ascii="Calibri" w:hAnsi="Calibri"/>
+                <w:color w:val="B86E00"/>
+                <w:sz w:val="20"/>
+              </w:rPr>
+              <w:t>Ausstehend</w:t>
+            </w:r>
+          </w:p>
+        </w:tc>
+      </w:tr>
+      <w:tr>
+        <w:tc>
+          <w:tcPr>
+            <w:tcW w:type="dxa" w:w="4536"/>
+            <w:shd w:val="clear" w:color="auto" w:fill="EEF3F8"/>
+          </w:tcPr>
+          <w:p>
+            <w:r>
+              <w:rPr>
+                <w:rFonts w:ascii="Calibri" w:hAnsi="Calibri"/>
+                <w:color w:val="C01050"/>
+                <w:sz w:val="20"/>
+              </w:rPr>
+              <w:t>Go-live</w:t>
+            </w:r>
+          </w:p>
+        </w:tc>
+        <w:tc>
+          <w:tcPr>
+            <w:tcW w:type="dxa" w:w="4536"/>
+          </w:tcPr>
+          <w:p>
+            <w:r>
+              <w:rPr>
+                <w:rFonts w:ascii="Calibri" w:hAnsi="Calibri"/>
+                <w:color w:val="C01050"/>
+                <w:sz w:val="20"/>
+              </w:rPr>
+              <w:t>1. Oktober 2026</w:t>
+            </w:r>
+          </w:p>
+        </w:tc>
+      </w:tr>
+    </w:tbl>
+    <w:p>
+      <w:pPr>
+        <w:spacing w:before="200" w:after="80"/>
+        <w:pBdr>
+          <w:bottom w:val="single" w:sz="4" w:color="E85D04"/>
+        </w:pBdr>
+      </w:pPr>
+      <w:r>
+        <w:rPr>
+          <w:rFonts w:ascii="Calibri" w:hAnsi="Calibri"/>
+          <w:b/>
+          <w:color w:val="E85D04"/>
+          <w:sz w:val="26"/>
+        </w:rPr>
+        <w:t>6.3 Geplante Module</w:t>
       </w:r>
     </w:p>
     <w:p>
@@ -3994,7 +4960,7 @@
     </w:p>
     <w:p>
       <w:pPr>
-        <w:spacing w:before="280" w:after="120"/>
+        <w:spacing w:before="200" w:after="80"/>
         <w:pBdr>
           <w:bottom w:val="single" w:sz="4" w:color="E85D04"/>
         </w:pBdr>
@@ -4006,20 +4972,7 @@
           <w:color w:val="E85D04"/>
           <w:sz w:val="26"/>
         </w:rPr>
-        <w:t>6.3 Wirtschaftliche Bewertung</w:t>
-      </w:r>
-    </w:p>
-    <w:p>
-      <w:pPr>
-        <w:spacing w:before="40" w:after="60"/>
-      </w:pPr>
-      <w:r>
-        <w:rPr>
-          <w:rFonts w:ascii="Calibri" w:hAnsi="Calibri"/>
-          <w:color w:val="1A1A2E"/>
-          <w:sz w:val="21"/>
-        </w:rPr>
-        <w:t>Die Migration zu Odoo Enterprise 19 ist wirtschaftlich klar vorteilhaft:</w:t>
+        <w:t>6.4 Wirtschaftliche Bewertung</w:t>
       </w:r>
     </w:p>
     <w:tbl>
@@ -4088,7 +5041,7 @@
                 <w:color w:val="1A1A2E"/>
                 <w:sz w:val="20"/>
               </w:rPr>
-              <w:t>eEvolution Lizenz + Support (aktuell)</w:t>
+              <w:t>eEvolution Lizenz + Support (heute)</w:t>
             </w:r>
           </w:p>
         </w:tc>
@@ -4151,10 +5104,10 @@
             <w:r>
               <w:rPr>
                 <w:rFonts w:ascii="Calibri" w:hAnsi="Calibri"/>
-                <w:color w:val="1A1A2E"/>
+                <w:color w:val="C01050"/>
                 <w:sz w:val="20"/>
               </w:rPr>
-              <w:t>Jährliche Einsparung (ab Migration)</w:t>
+              <w:t>Jährliche Einsparung (ab Go-live 1.10.2026)</w:t>
             </w:r>
           </w:p>
         </w:tc>
@@ -4199,7 +5152,7 @@
             <w:r>
               <w:rPr>
                 <w:rFonts w:ascii="Calibri" w:hAnsi="Calibri"/>
-                <w:color w:val="1A1A2E"/>
+                <w:color w:val="C01050"/>
                 <w:sz w:val="20"/>
               </w:rPr>
               <w:t>ca. 12–18 Monate nach Go-live</w:t>
@@ -4232,7 +5185,7 @@
     </w:p>
     <w:p>
       <w:pPr>
-        <w:spacing w:before="280" w:after="120"/>
+        <w:spacing w:before="200" w:after="80"/>
         <w:pBdr>
           <w:bottom w:val="single" w:sz="4" w:color="E85D04"/>
         </w:pBdr>
@@ -4257,72 +5210,12 @@
           <w:color w:val="1A1A2E"/>
           <w:sz w:val="21"/>
         </w:rPr>
-        <w:t>Kling &amp; Freitag verfolgt einen bewusst konservativen, aber zukunftsfähigen KI-Ansatz: "Regeln zuerst – KI nur als kontrollierte Prüfinstanz." Dies bedeutet:</w:t>
+        <w:t>"Regeln zuerst – KI nur als kontrollierte Prüfinstanz." Regelbasierte Systeme bilden die Grundschicht; KI übernimmt Grenz- und Zweifelsfälle. Alle KI-Entscheidungen sind nachvollziehbar und durch Operatoren korrigierbar. Kein Cloud-KI-Einsatz – alle Modelle laufen vollständig On-Premise (Datenschutz, Kostenkontrolle).</w:t>
       </w:r>
     </w:p>
     <w:p>
       <w:pPr>
-        <w:pStyle w:val="ListBullet"/>
-        <w:spacing w:before="20" w:after="20"/>
-        <w:ind w:left="283"/>
-      </w:pPr>
-      <w:r>
-        <w:rPr>
-          <w:rFonts w:ascii="Calibri" w:hAnsi="Calibri"/>
-          <w:color w:val="1A1A2E"/>
-          <w:sz w:val="21"/>
-        </w:rPr>
-        <w:t>Primäre Klassifizierung erfolgt über regelbasierte Logik (deterministische Systeme)</w:t>
-      </w:r>
-    </w:p>
-    <w:p>
-      <w:pPr>
-        <w:pStyle w:val="ListBullet"/>
-        <w:spacing w:before="20" w:after="20"/>
-        <w:ind w:left="283"/>
-      </w:pPr>
-      <w:r>
-        <w:rPr>
-          <w:rFonts w:ascii="Calibri" w:hAnsi="Calibri"/>
-          <w:color w:val="1A1A2E"/>
-          <w:sz w:val="21"/>
-        </w:rPr>
-        <w:t>KI übernimmt Grenz- und Zweifelsfälle, die Regeln nicht eindeutig lösen können</w:t>
-      </w:r>
-    </w:p>
-    <w:p>
-      <w:pPr>
-        <w:pStyle w:val="ListBullet"/>
-        <w:spacing w:before="20" w:after="20"/>
-        <w:ind w:left="283"/>
-      </w:pPr>
-      <w:r>
-        <w:rPr>
-          <w:rFonts w:ascii="Calibri" w:hAnsi="Calibri"/>
-          <w:color w:val="1A1A2E"/>
-          <w:sz w:val="21"/>
-        </w:rPr>
-        <w:t>Alle KI-Entscheidungen sind nachvollziehbar und können durch Operatoren korrigiert werden</w:t>
-      </w:r>
-    </w:p>
-    <w:p>
-      <w:pPr>
-        <w:pStyle w:val="ListBullet"/>
-        <w:spacing w:before="20" w:after="20"/>
-        <w:ind w:left="283"/>
-      </w:pPr>
-      <w:r>
-        <w:rPr>
-          <w:rFonts w:ascii="Calibri" w:hAnsi="Calibri"/>
-          <w:color w:val="1A1A2E"/>
-          <w:sz w:val="21"/>
-        </w:rPr>
-        <w:t>Kein Einsatz von Cloud-KI – alle Modelle laufen On-Premise (Datenschutz)</w:t>
-      </w:r>
-    </w:p>
-    <w:p>
-      <w:pPr>
-        <w:spacing w:before="280" w:after="120"/>
+        <w:spacing w:before="200" w:after="80"/>
         <w:pBdr>
           <w:bottom w:val="single" w:sz="4" w:color="E85D04"/>
         </w:pBdr>
@@ -4334,7 +5227,210 @@
           <w:color w:val="E85D04"/>
           <w:sz w:val="26"/>
         </w:rPr>
-        <w:t>7.2 Einsatzbereiche</w:t>
+        <w:t>7.2 Infrastruktur (aktuell)</w:t>
+      </w:r>
+    </w:p>
+    <w:tbl>
+      <w:tblPr>
+        <w:tblStyle w:val="TableGrid"/>
+        <w:tblW w:type="auto" w:w="0"/>
+        <w:jc w:val="center"/>
+        <w:tblLook w:firstColumn="1" w:firstRow="1" w:lastColumn="0" w:lastRow="0" w:noHBand="0" w:noVBand="1" w:val="04A0"/>
+      </w:tblPr>
+      <w:tblGrid>
+        <w:gridCol w:w="4536"/>
+        <w:gridCol w:w="4536"/>
+      </w:tblGrid>
+      <w:tr>
+        <w:tc>
+          <w:tcPr>
+            <w:tcW w:type="dxa" w:w="4536"/>
+            <w:shd w:val="clear" w:color="auto" w:fill="0F3D6B"/>
+          </w:tcPr>
+          <w:p>
+            <w:pPr>
+              <w:jc w:val="center"/>
+            </w:pPr>
+            <w:r>
+              <w:rPr>
+                <w:rFonts w:ascii="Calibri" w:hAnsi="Calibri"/>
+                <w:b/>
+                <w:color w:val="FFFFFF"/>
+                <w:sz w:val="20"/>
+              </w:rPr>
+              <w:t>Komponente</w:t>
+            </w:r>
+          </w:p>
+        </w:tc>
+        <w:tc>
+          <w:tcPr>
+            <w:tcW w:type="dxa" w:w="4536"/>
+            <w:shd w:val="clear" w:color="auto" w:fill="0F3D6B"/>
+          </w:tcPr>
+          <w:p>
+            <w:pPr>
+              <w:jc w:val="center"/>
+            </w:pPr>
+            <w:r>
+              <w:rPr>
+                <w:rFonts w:ascii="Calibri" w:hAnsi="Calibri"/>
+                <w:b/>
+                <w:color w:val="FFFFFF"/>
+                <w:sz w:val="20"/>
+              </w:rPr>
+              <w:t>Status</w:t>
+            </w:r>
+          </w:p>
+        </w:tc>
+      </w:tr>
+      <w:tr>
+        <w:tc>
+          <w:tcPr>
+            <w:tcW w:type="dxa" w:w="4536"/>
+            <w:shd w:val="clear" w:color="auto" w:fill="EEF3F8"/>
+          </w:tcPr>
+          <w:p>
+            <w:r>
+              <w:rPr>
+                <w:rFonts w:ascii="Calibri" w:hAnsi="Calibri"/>
+                <w:color w:val="1A1A2E"/>
+                <w:sz w:val="20"/>
+              </w:rPr>
+              <w:t>Plattform</w:t>
+            </w:r>
+          </w:p>
+        </w:tc>
+        <w:tc>
+          <w:tcPr>
+            <w:tcW w:type="dxa" w:w="4536"/>
+          </w:tcPr>
+          <w:p>
+            <w:r>
+              <w:rPr>
+                <w:rFonts w:ascii="Calibri" w:hAnsi="Calibri"/>
+                <w:color w:val="1A1A2E"/>
+                <w:sz w:val="20"/>
+              </w:rPr>
+              <w:t>Ollama (lokal)</w:t>
+            </w:r>
+          </w:p>
+        </w:tc>
+      </w:tr>
+      <w:tr>
+        <w:tc>
+          <w:tcPr>
+            <w:tcW w:type="dxa" w:w="4536"/>
+            <w:shd w:val="clear" w:color="auto" w:fill="EEF3F8"/>
+          </w:tcPr>
+          <w:p>
+            <w:r>
+              <w:rPr>
+                <w:rFonts w:ascii="Calibri" w:hAnsi="Calibri"/>
+                <w:color w:val="1A1A2E"/>
+                <w:sz w:val="20"/>
+              </w:rPr>
+              <w:t>Modell 1</w:t>
+            </w:r>
+          </w:p>
+        </w:tc>
+        <w:tc>
+          <w:tcPr>
+            <w:tcW w:type="dxa" w:w="4536"/>
+          </w:tcPr>
+          <w:p>
+            <w:r>
+              <w:rPr>
+                <w:rFonts w:ascii="Calibri" w:hAnsi="Calibri"/>
+                <w:color w:val="1A1A2E"/>
+                <w:sz w:val="20"/>
+              </w:rPr>
+              <w:t>qwen3:8b – schnelle Klassifizierung</w:t>
+            </w:r>
+          </w:p>
+        </w:tc>
+      </w:tr>
+      <w:tr>
+        <w:tc>
+          <w:tcPr>
+            <w:tcW w:type="dxa" w:w="4536"/>
+            <w:shd w:val="clear" w:color="auto" w:fill="EEF3F8"/>
+          </w:tcPr>
+          <w:p>
+            <w:r>
+              <w:rPr>
+                <w:rFonts w:ascii="Calibri" w:hAnsi="Calibri"/>
+                <w:color w:val="1A1A2E"/>
+                <w:sz w:val="20"/>
+              </w:rPr>
+              <w:t>Modell 2</w:t>
+            </w:r>
+          </w:p>
+        </w:tc>
+        <w:tc>
+          <w:tcPr>
+            <w:tcW w:type="dxa" w:w="4536"/>
+          </w:tcPr>
+          <w:p>
+            <w:r>
+              <w:rPr>
+                <w:rFonts w:ascii="Calibri" w:hAnsi="Calibri"/>
+                <w:color w:val="1A1A2E"/>
+                <w:sz w:val="20"/>
+              </w:rPr>
+              <w:t>qwen2.5:72b – komplexe Analyse, Extraktion, Prognosen</w:t>
+            </w:r>
+          </w:p>
+        </w:tc>
+      </w:tr>
+      <w:tr>
+        <w:tc>
+          <w:tcPr>
+            <w:tcW w:type="dxa" w:w="4536"/>
+            <w:shd w:val="clear" w:color="auto" w:fill="EEF3F8"/>
+          </w:tcPr>
+          <w:p>
+            <w:r>
+              <w:rPr>
+                <w:rFonts w:ascii="Calibri" w:hAnsi="Calibri"/>
+                <w:color w:val="1A1A2E"/>
+                <w:sz w:val="20"/>
+              </w:rPr>
+              <w:t>GPU</w:t>
+            </w:r>
+          </w:p>
+        </w:tc>
+        <w:tc>
+          <w:tcPr>
+            <w:tcW w:type="dxa" w:w="4536"/>
+          </w:tcPr>
+          <w:p>
+            <w:r>
+              <w:rPr>
+                <w:rFonts w:ascii="Calibri" w:hAnsi="Calibri"/>
+                <w:color w:val="1B7A47"/>
+                <w:sz w:val="20"/>
+              </w:rPr>
+              <w:t>NVIDIA RTX 4090 – Läuft (Produktionssystem)</w:t>
+            </w:r>
+          </w:p>
+        </w:tc>
+      </w:tr>
+    </w:tbl>
+    <w:p>
+      <w:pPr>
+        <w:spacing w:before="200" w:after="80"/>
+        <w:pBdr>
+          <w:bottom w:val="single" w:sz="4" w:color="E85D04"/>
+        </w:pBdr>
+      </w:pPr>
+      <w:r>
+        <w:rPr>
+          <w:rFonts w:ascii="Calibri" w:hAnsi="Calibri"/>
+          <w:b/>
+          <w:color w:val="E85D04"/>
+          <w:sz w:val="26"/>
+        </w:rPr>
+        <w:t>7.3 Einsatzbereiche</w:t>
       </w:r>
     </w:p>
     <w:tbl>
@@ -4418,7 +5514,7 @@
                 <w:color w:val="1A1A2E"/>
                 <w:sz w:val="20"/>
               </w:rPr>
-              <w:t>Automatische Erkennung von Rechnungen, Lieferscheinen, Verträgen etc.</w:t>
+              <w:t>Automatische Erkennung von Rechnungen, Lieferscheinen, Verträgen</w:t>
             </w:r>
           </w:p>
         </w:tc>
@@ -4451,7 +5547,7 @@
                 <w:color w:val="1A1A2E"/>
                 <w:sz w:val="20"/>
               </w:rPr>
-              <w:t>Erkennung von Datum, Betrag, Lieferant, Kostenstelle aus Dokumenten</w:t>
+              <w:t>Datum, Betrag, Lieferant, Kostenstelle aus Dokumenten</w:t>
             </w:r>
           </w:p>
         </w:tc>
@@ -4550,256 +5646,7 @@
                 <w:color w:val="1A1A2E"/>
                 <w:sz w:val="20"/>
               </w:rPr>
-              <w:t>Kurzfristige Absatz- und Bestandsprognosen auf Basis historischer Daten</w:t>
-            </w:r>
-          </w:p>
-        </w:tc>
-      </w:tr>
-    </w:tbl>
-    <w:p>
-      <w:pPr>
-        <w:spacing w:before="280" w:after="120"/>
-        <w:pBdr>
-          <w:bottom w:val="single" w:sz="4" w:color="E85D04"/>
-        </w:pBdr>
-      </w:pPr>
-      <w:r>
-        <w:rPr>
-          <w:rFonts w:ascii="Calibri" w:hAnsi="Calibri"/>
-          <w:b/>
-          <w:color w:val="E85D04"/>
-          <w:sz w:val="26"/>
-        </w:rPr>
-        <w:t>7.3 Hardware-Roadmap</w:t>
-      </w:r>
-    </w:p>
-    <w:p>
-      <w:pPr>
-        <w:spacing w:before="40" w:after="60"/>
-      </w:pPr>
-      <w:r>
-        <w:rPr>
-          <w:rFonts w:ascii="Calibri" w:hAnsi="Calibri"/>
-          <w:color w:val="1A1A2E"/>
-          <w:sz w:val="21"/>
-        </w:rPr>
-        <w:t>Die KI-Infrastruktur wird schrittweise ausgebaut, um die wachsenden Anforderungen zu erfüllen:</w:t>
-      </w:r>
-    </w:p>
-    <w:tbl>
-      <w:tblPr>
-        <w:tblStyle w:val="TableGrid"/>
-        <w:tblW w:type="auto" w:w="0"/>
-        <w:jc w:val="center"/>
-        <w:tblLook w:firstColumn="1" w:firstRow="1" w:lastColumn="0" w:lastRow="0" w:noHBand="0" w:noVBand="1" w:val="04A0"/>
-      </w:tblPr>
-      <w:tblGrid>
-        <w:gridCol w:w="3024"/>
-        <w:gridCol w:w="3024"/>
-        <w:gridCol w:w="3024"/>
-      </w:tblGrid>
-      <w:tr>
-        <w:tc>
-          <w:tcPr>
-            <w:tcW w:type="dxa" w:w="3024"/>
-            <w:shd w:val="clear" w:color="auto" w:fill="0F3D6B"/>
-          </w:tcPr>
-          <w:p>
-            <w:pPr>
-              <w:jc w:val="center"/>
-            </w:pPr>
-            <w:r>
-              <w:rPr>
-                <w:rFonts w:ascii="Calibri" w:hAnsi="Calibri"/>
-                <w:b/>
-                <w:color w:val="FFFFFF"/>
-                <w:sz w:val="20"/>
-              </w:rPr>
-              <w:t>Hardware</w:t>
-            </w:r>
-          </w:p>
-        </w:tc>
-        <w:tc>
-          <w:tcPr>
-            <w:tcW w:type="dxa" w:w="3024"/>
-            <w:shd w:val="clear" w:color="auto" w:fill="0F3D6B"/>
-          </w:tcPr>
-          <w:p>
-            <w:pPr>
-              <w:jc w:val="center"/>
-            </w:pPr>
-            <w:r>
-              <w:rPr>
-                <w:rFonts w:ascii="Calibri" w:hAnsi="Calibri"/>
-                <w:b/>
-                <w:color w:val="FFFFFF"/>
-                <w:sz w:val="20"/>
-              </w:rPr>
-              <w:t>Status</w:t>
-            </w:r>
-          </w:p>
-        </w:tc>
-        <w:tc>
-          <w:tcPr>
-            <w:tcW w:type="dxa" w:w="3024"/>
-            <w:shd w:val="clear" w:color="auto" w:fill="0F3D6B"/>
-          </w:tcPr>
-          <w:p>
-            <w:pPr>
-              <w:jc w:val="center"/>
-            </w:pPr>
-            <w:r>
-              <w:rPr>
-                <w:rFonts w:ascii="Calibri" w:hAnsi="Calibri"/>
-                <w:b/>
-                <w:color w:val="FFFFFF"/>
-                <w:sz w:val="20"/>
-              </w:rPr>
-              <w:t>Verwendung</w:t>
-            </w:r>
-          </w:p>
-        </w:tc>
-      </w:tr>
-      <w:tr>
-        <w:tc>
-          <w:tcPr>
-            <w:tcW w:type="dxa" w:w="3024"/>
-            <w:shd w:val="clear" w:color="auto" w:fill="EEF3F8"/>
-          </w:tcPr>
-          <w:p>
-            <w:r>
-              <w:rPr>
-                <w:rFonts w:ascii="Calibri" w:hAnsi="Calibri"/>
-                <w:color w:val="1A1A2E"/>
-                <w:sz w:val="20"/>
-              </w:rPr>
-              <w:t>RTX 3060 Ti</w:t>
-            </w:r>
-          </w:p>
-        </w:tc>
-        <w:tc>
-          <w:tcPr>
-            <w:tcW w:type="dxa" w:w="3024"/>
-          </w:tcPr>
-          <w:p>
-            <w:r>
-              <w:rPr>
-                <w:rFonts w:ascii="Calibri" w:hAnsi="Calibri"/>
-                <w:color w:val="1A1A2E"/>
-                <w:sz w:val="20"/>
-              </w:rPr>
-              <w:t>Vorhanden</w:t>
-            </w:r>
-          </w:p>
-        </w:tc>
-        <w:tc>
-          <w:tcPr>
-            <w:tcW w:type="dxa" w:w="3024"/>
-          </w:tcPr>
-          <w:p>
-            <w:r>
-              <w:rPr>
-                <w:rFonts w:ascii="Calibri" w:hAnsi="Calibri"/>
-                <w:color w:val="1A1A2E"/>
-                <w:sz w:val="20"/>
-              </w:rPr>
-              <w:t>Testbetrieb, schnelle Modelle (qwen3:8b)</w:t>
-            </w:r>
-          </w:p>
-        </w:tc>
-      </w:tr>
-      <w:tr>
-        <w:tc>
-          <w:tcPr>
-            <w:tcW w:type="dxa" w:w="3024"/>
-            <w:shd w:val="clear" w:color="auto" w:fill="EEF3F8"/>
-          </w:tcPr>
-          <w:p>
-            <w:r>
-              <w:rPr>
-                <w:rFonts w:ascii="Calibri" w:hAnsi="Calibri"/>
-                <w:color w:val="1A1A2E"/>
-                <w:sz w:val="20"/>
-              </w:rPr>
-              <w:t>RTX 4090 (24 GB)</w:t>
-            </w:r>
-          </w:p>
-        </w:tc>
-        <w:tc>
-          <w:tcPr>
-            <w:tcW w:type="dxa" w:w="3024"/>
-          </w:tcPr>
-          <w:p>
-            <w:r>
-              <w:rPr>
-                <w:rFonts w:ascii="Calibri" w:hAnsi="Calibri"/>
-                <w:color w:val="1A1A2E"/>
-                <w:sz w:val="20"/>
-              </w:rPr>
-              <w:t>In Planung</w:t>
-            </w:r>
-          </w:p>
-        </w:tc>
-        <w:tc>
-          <w:tcPr>
-            <w:tcW w:type="dxa" w:w="3024"/>
-          </w:tcPr>
-          <w:p>
-            <w:r>
-              <w:rPr>
-                <w:rFonts w:ascii="Calibri" w:hAnsi="Calibri"/>
-                <w:color w:val="1A1A2E"/>
-                <w:sz w:val="20"/>
-              </w:rPr>
-              <w:t>Produktionsbetrieb, große Modelle (qwen2.5:72b)</w:t>
-            </w:r>
-          </w:p>
-        </w:tc>
-      </w:tr>
-      <w:tr>
-        <w:tc>
-          <w:tcPr>
-            <w:tcW w:type="dxa" w:w="3024"/>
-            <w:shd w:val="clear" w:color="auto" w:fill="EEF3F8"/>
-          </w:tcPr>
-          <w:p>
-            <w:r>
-              <w:rPr>
-                <w:rFonts w:ascii="Calibri" w:hAnsi="Calibri"/>
-                <w:color w:val="1A1A2E"/>
-                <w:sz w:val="20"/>
-              </w:rPr>
-              <w:t>Dual-GPU-Setup</w:t>
-            </w:r>
-          </w:p>
-        </w:tc>
-        <w:tc>
-          <w:tcPr>
-            <w:tcW w:type="dxa" w:w="3024"/>
-          </w:tcPr>
-          <w:p>
-            <w:r>
-              <w:rPr>
-                <w:rFonts w:ascii="Calibri" w:hAnsi="Calibri"/>
-                <w:color w:val="1A1A2E"/>
-                <w:sz w:val="20"/>
-              </w:rPr>
-              <w:t>Langfristig</w:t>
-            </w:r>
-          </w:p>
-        </w:tc>
-        <w:tc>
-          <w:tcPr>
-            <w:tcW w:type="dxa" w:w="3024"/>
-          </w:tcPr>
-          <w:p>
-            <w:r>
-              <w:rPr>
-                <w:rFonts w:ascii="Calibri" w:hAnsi="Calibri"/>
-                <w:color w:val="1A1A2E"/>
-                <w:sz w:val="20"/>
-              </w:rPr>
-              <w:t>Parallelbetrieb mehrerer Modelle / erhöhter Durchsatz</w:t>
+              <w:t>Kurzfristige Absatz- und Bestandsprognosen</w:t>
             </w:r>
           </w:p>
         </w:tc>
@@ -4911,6 +5758,54 @@
             <w:r>
               <w:rPr>
                 <w:rFonts w:ascii="Calibri" w:hAnsi="Calibri"/>
+                <w:color w:val="C01050"/>
+                <w:sz w:val="20"/>
+              </w:rPr>
+              <w:t>Go-live-Termin 1.10.2026 unter Druck</w:t>
+            </w:r>
+          </w:p>
+        </w:tc>
+        <w:tc>
+          <w:tcPr>
+            <w:tcW w:type="dxa" w:w="3024"/>
+          </w:tcPr>
+          <w:p>
+            <w:r>
+              <w:rPr>
+                <w:rFonts w:ascii="Calibri" w:hAnsi="Calibri"/>
+                <w:color w:val="1A1A2E"/>
+                <w:sz w:val="20"/>
+              </w:rPr>
+              <w:t>Mittel</w:t>
+            </w:r>
+          </w:p>
+        </w:tc>
+        <w:tc>
+          <w:tcPr>
+            <w:tcW w:type="dxa" w:w="3024"/>
+          </w:tcPr>
+          <w:p>
+            <w:r>
+              <w:rPr>
+                <w:rFonts w:ascii="Calibri" w:hAnsi="Calibri"/>
+                <w:color w:val="1A1A2E"/>
+                <w:sz w:val="20"/>
+              </w:rPr>
+              <w:t>Subdomain &amp; VPN jetzt priorisieren; täglichen Fortschritt tracken</w:t>
+            </w:r>
+          </w:p>
+        </w:tc>
+      </w:tr>
+      <w:tr>
+        <w:tc>
+          <w:tcPr>
+            <w:tcW w:type="dxa" w:w="3024"/>
+            <w:shd w:val="clear" w:color="auto" w:fill="EEF3F8"/>
+          </w:tcPr>
+          <w:p>
+            <w:r>
+              <w:rPr>
+                <w:rFonts w:ascii="Calibri" w:hAnsi="Calibri"/>
                 <w:color w:val="1A1A2E"/>
                 <w:sz w:val="20"/>
               </w:rPr>
@@ -4929,7 +5824,7 @@
                 <w:color w:val="1A1A2E"/>
                 <w:sz w:val="20"/>
               </w:rPr>
-              <w:t>Hoch</w:t>
+              <w:t>Mittel</w:t>
             </w:r>
           </w:p>
         </w:tc>
@@ -4944,7 +5839,7 @@
                 <w:color w:val="1A1A2E"/>
                 <w:sz w:val="20"/>
               </w:rPr>
-              <w:t>Phasenweiser Rollout; parallelbetrieb ERP-Systeme; Testmigration vorab</w:t>
+              <w:t>Phasenweiser Rollout; Parallelbetrieb; Testmigration vorab</w:t>
             </w:r>
           </w:p>
         </w:tc>
@@ -5040,7 +5935,7 @@
                 <w:color w:val="1A1A2E"/>
                 <w:sz w:val="20"/>
               </w:rPr>
-              <w:t>Prüffallmanagement im Trichter; manuelle Überprüfung kritischer Dokumente</w:t>
+              <w:t>Prüffallmanagement; manuelle Prüfung kritischer Dokumente</w:t>
             </w:r>
           </w:p>
         </w:tc>
@@ -5073,54 +5968,6 @@
                 <w:color w:val="1A1A2E"/>
                 <w:sz w:val="20"/>
               </w:rPr>
-              <w:t>Mittel</w:t>
-            </w:r>
-          </w:p>
-        </w:tc>
-        <w:tc>
-          <w:tcPr>
-            <w:tcW w:type="dxa" w:w="3024"/>
-          </w:tcPr>
-          <w:p>
-            <w:r>
-              <w:rPr>
-                <w:rFonts w:ascii="Calibri" w:hAnsi="Calibri"/>
-                <w:color w:val="1A1A2E"/>
-                <w:sz w:val="20"/>
-              </w:rPr>
-              <w:t>Tägliche Backups; geprüfte Wiederherstellung; Redundanz über Synology</w:t>
-            </w:r>
-          </w:p>
-        </w:tc>
-      </w:tr>
-      <w:tr>
-        <w:tc>
-          <w:tcPr>
-            <w:tcW w:type="dxa" w:w="3024"/>
-            <w:shd w:val="clear" w:color="auto" w:fill="EEF3F8"/>
-          </w:tcPr>
-          <w:p>
-            <w:r>
-              <w:rPr>
-                <w:rFonts w:ascii="Calibri" w:hAnsi="Calibri"/>
-                <w:color w:val="1A1A2E"/>
-                <w:sz w:val="20"/>
-              </w:rPr>
-              <w:t>GPU-Engpass / Lieferzeit</w:t>
-            </w:r>
-          </w:p>
-        </w:tc>
-        <w:tc>
-          <w:tcPr>
-            <w:tcW w:type="dxa" w:w="3024"/>
-          </w:tcPr>
-          <w:p>
-            <w:r>
-              <w:rPr>
-                <w:rFonts w:ascii="Calibri" w:hAnsi="Calibri"/>
-                <w:color w:val="1A1A2E"/>
-                <w:sz w:val="20"/>
-              </w:rPr>
               <w:t>Niedrig</w:t>
             </w:r>
           </w:p>
@@ -5136,7 +5983,7 @@
                 <w:color w:val="1A1A2E"/>
                 <w:sz w:val="20"/>
               </w:rPr>
-              <w:t>Frühzeitige Bestellung RTX 4090; Fallback auf kleinere Modelle</w:t>
+              <w:t>Tägliche Backups; geprüfte Wiederherstellung; Synology-Redundanz</w:t>
             </w:r>
           </w:p>
         </w:tc>
@@ -5184,7 +6031,7 @@
                 <w:color w:val="1A1A2E"/>
                 <w:sz w:val="20"/>
               </w:rPr>
-              <w:t>API-first Integrationen; regelmäßige Kompatibilitätstests vor Updates</w:t>
+              <w:t>API-first Integrationen; Kompatibilitätstests vor Updates</w:t>
             </w:r>
           </w:p>
         </w:tc>
@@ -5260,7 +6107,7 @@
                 <w:color w:val="FFFFFF"/>
                 <w:sz w:val="20"/>
               </w:rPr>
-              <w:t>Geschätzte Kosten</w:t>
+              <w:t>Kosten / Status</w:t>
             </w:r>
           </w:p>
         </w:tc>
@@ -5356,10 +6203,10 @@
             <w:r>
               <w:rPr>
                 <w:rFonts w:ascii="Calibri" w:hAnsi="Calibri"/>
-                <w:color w:val="1A1A2E"/>
+                <w:color w:val="1B7A47"/>
                 <w:sz w:val="20"/>
               </w:rPr>
-              <w:t>ca. 1.500–2.000 €</w:t>
+              <w:t>beschafft und in Betrieb</w:t>
             </w:r>
           </w:p>
         </w:tc>
@@ -5476,7 +6323,7 @@
                 <w:color w:val="1A1A2E"/>
                 <w:sz w:val="20"/>
               </w:rPr>
-              <w:t>GESAMT Investition (einmalig)</w:t>
+              <w:t>GESAMT Investition einmalig (Rest)</w:t>
             </w:r>
           </w:p>
         </w:tc>
@@ -5491,7 +6338,7 @@
                 <w:color w:val="1A1A2E"/>
                 <w:sz w:val="20"/>
               </w:rPr>
-              <w:t>ca. 21.500–43.000 €</w:t>
+              <w:t>ca. 20.000–41.000 €</w:t>
             </w:r>
           </w:p>
         </w:tc>
@@ -5506,10 +6353,10 @@
             <w:r>
               <w:rPr>
                 <w:rFonts w:ascii="Calibri" w:hAnsi="Calibri"/>
-                <w:color w:val="1A1A2E"/>
+                <w:color w:val="C01050"/>
                 <w:sz w:val="20"/>
               </w:rPr>
-              <w:t>GESAMT laufend p.a. (Einsparung: ~42k → ~12k)</w:t>
+              <w:t>GESAMT laufend p.a. (nach Odoo Go-live)</w:t>
             </w:r>
           </w:p>
         </w:tc>
@@ -5529,6 +6376,39 @@
           </w:p>
         </w:tc>
       </w:tr>
+      <w:tr>
+        <w:tc>
+          <w:tcPr>
+            <w:tcW w:type="dxa" w:w="4536"/>
+            <w:shd w:val="clear" w:color="auto" w:fill="EEF3F8"/>
+          </w:tcPr>
+          <w:p>
+            <w:r>
+              <w:rPr>
+                <w:rFonts w:ascii="Calibri" w:hAnsi="Calibri"/>
+                <w:color w:val="1A1A2E"/>
+                <w:sz w:val="20"/>
+              </w:rPr>
+              <w:t>Jährliche Einsparung gegenüber heute</w:t>
+            </w:r>
+          </w:p>
+        </w:tc>
+        <w:tc>
+          <w:tcPr>
+            <w:tcW w:type="dxa" w:w="4536"/>
+          </w:tcPr>
+          <w:p>
+            <w:r>
+              <w:rPr>
+                <w:rFonts w:ascii="Calibri" w:hAnsi="Calibri"/>
+                <w:color w:val="1A1A2E"/>
+                <w:sz w:val="20"/>
+              </w:rPr>
+              <w:t>ca. 27.000–34.000 €</w:t>
+            </w:r>
+          </w:p>
+        </w:tc>
+      </w:tr>
     </w:tbl>
     <w:p>
       <w:pPr>
@@ -5540,7 +6420,7 @@
           <w:color w:val="1A1A2E"/>
           <w:sz w:val="21"/>
         </w:rPr>
-        <w:t>Hinweis: Die einmaligen Investitionskosten amortisieren sich durch die jährliche Einsparung bei den ERP-Kosten innerhalb von 12–18 Monaten nach vollständiger Migration.</w:t>
+        <w:t>Die einmaligen Migrationskosten amortisieren sich durch die jährliche ERP-Kosteneinsparung von ~34.000 € innerhalb von 12–18 Monaten nach dem Go-live am 1. Oktober 2026.</w:t>
       </w:r>
     </w:p>
     <w:p>
@@ -5575,12 +6455,12 @@
           <w:color w:val="1A1A2E"/>
           <w:sz w:val="21"/>
         </w:rPr>
-        <w:t>Kling &amp; Freitag befindet sich an einem entscheidenden Wendepunkt seiner IT-Geschichte. Die Kombination aus einem technologisch veralteten ERP-System, wachsenden Anforderungen an Dokumentenmanagement und dem Potenzial moderner KI-Systeme schafft ein klares Handlungserfordernis – aber auch eine einmalige Chance.</w:t>
+        <w:t>Kling &amp; Freitag ist auf dem richtigen Weg und liefert konkrete Ergebnisse: Odoo läuft mit Reverse Proxy und HTTPS, die erste Datenmigration ist abgeschlossen, die RTX 4090 KI-Infrastruktur ist produktiv. Der Go-live-Termin 1. Oktober 2026 ist realistisch und sollte als verbindliches Ziel gelten.</w:t>
       </w:r>
     </w:p>
     <w:p>
       <w:pPr>
-        <w:spacing w:before="280" w:after="120"/>
+        <w:spacing w:before="200" w:after="80"/>
         <w:pBdr>
           <w:bottom w:val="single" w:sz="4" w:color="E85D04"/>
         </w:pBdr>
@@ -5592,7 +6472,7 @@
           <w:color w:val="E85D04"/>
           <w:sz w:val="26"/>
         </w:rPr>
-        <w:t>Was jetzt richtig ist:</w:t>
+        <w:t>Offene Punkte bis Go-live (1. Oktober 2026):</w:t>
       </w:r>
     </w:p>
     <w:p>
@@ -5607,7 +6487,7 @@
           <w:color w:val="1A1A2E"/>
           <w:sz w:val="21"/>
         </w:rPr>
-        <w:t>Den eingeschlagenen Weg konsequent weiterverfolgen – alle Projekte sind strategisch korrekt ausgerichtet</w:t>
+        <w:t>Subdomain auf dem Webserver einrichten → letzter Schritt für externe Erreichbarkeit</w:t>
       </w:r>
     </w:p>
     <w:p>
@@ -5622,7 +6502,7 @@
           <w:color w:val="1A1A2E"/>
           <w:sz w:val="21"/>
         </w:rPr>
-        <w:t>Odoo-Migration priorisieren – sie ist der Schlüssel zur Kostenentlastung und Modernisierung</w:t>
+        <w:t>VPN-Konzept finalisieren und umsetzen</w:t>
       </w:r>
     </w:p>
     <w:p>
@@ -5637,7 +6517,7 @@
           <w:color w:val="1A1A2E"/>
           <w:sz w:val="21"/>
         </w:rPr>
-        <w:t>Dokumententrichter als Wettbewerbsvorteil sehen – er ist einzigartig und schafft nachhaltigen Mehrwert</w:t>
+        <w:t>Vollständige Datenmigration eEvolution → Odoo abschließen</w:t>
       </w:r>
     </w:p>
     <w:p>
@@ -5652,7 +6532,7 @@
           <w:color w:val="1A1A2E"/>
           <w:sz w:val="21"/>
         </w:rPr>
-        <w:t>KI schrittweise ausbauen – pragmatisch und ohne Hype, mit klarem Nutzennachweis je Anwendungsfall</w:t>
+        <w:t>User-Schulungen durchführen</w:t>
       </w:r>
     </w:p>
     <w:p>
@@ -5667,12 +6547,12 @@
           <w:color w:val="1A1A2E"/>
           <w:sz w:val="21"/>
         </w:rPr>
-        <w:t>Dokumentation und Know-how-Transfer als Pflicht – nicht als Option</w:t>
+        <w:t>Go-live Odoo Enterprise 19: 1. Oktober 2026</w:t>
       </w:r>
     </w:p>
     <w:p>
       <w:pPr>
-        <w:spacing w:before="280" w:after="120"/>
+        <w:spacing w:before="200" w:after="80"/>
         <w:pBdr>
           <w:bottom w:val="single" w:sz="4" w:color="E85D04"/>
         </w:pBdr>
@@ -5684,7 +6564,7 @@
           <w:color w:val="E85D04"/>
           <w:sz w:val="26"/>
         </w:rPr>
-        <w:t>Langfristiges Zielbild:</w:t>
+        <w:t>Strategische Empfehlung:</w:t>
       </w:r>
     </w:p>
     <w:p>
@@ -5697,7 +6577,20 @@
           <w:color w:val="1A1A2E"/>
           <w:sz w:val="21"/>
         </w:rPr>
-        <w:t>Kling &amp; Freitag wird bis 2027 über eine vollständig integrierte, lokale IT-Plattform verfügen, die alle Geschäftsprozesse digital und effizient abbildet. Die IT wird vom Kostenfaktor zum echten Wettbewerbsvorteil – durch niedrigere Betriebskosten, schnellere Prozesse, bessere Datenqualität und die einzigartige Fähigkeit, historisches Wissen zu digitalisieren und nutzbar zu machen.</w:t>
+        <w:t>Fokus auf den Go-live-Termin 1. Oktober 2026. Danach: eEvolution abschalten und die ~42.000 € jährliche Ersparnis realisieren. Parallel Dokumententrichter und bitfarm DMS produktiv bringen. Die KI-Infrastruktur (RTX 4090 läuft) ist bereit – sie wartet nur auf die Workflows.</w:t>
+      </w:r>
+    </w:p>
+    <w:p>
+      <w:pPr>
+        <w:spacing w:before="40" w:after="60"/>
+      </w:pPr>
+      <w:r>
+        <w:rPr>
+          <w:rFonts w:ascii="Calibri" w:hAnsi="Calibri"/>
+          <w:color w:val="1A1A2E"/>
+          <w:sz w:val="21"/>
+        </w:rPr>
+        <w:t>Bis Ende 2027 wird Kling &amp; Freitag über eine vollständig integrierte, lokale IT-Plattform verfügen, die alle Geschäftsprozesse digital abbildet – und die IT vom Kostenfaktor zum echten Wettbewerbsvorteil macht.</w:t>
       </w:r>
     </w:p>
     <w:p/>
@@ -5726,7 +6619,7 @@
                 <w:color w:val="B0C4D8"/>
                 <w:sz w:val="18"/>
               </w:rPr>
-              <w:t>Kling &amp; Freitag GmbH  |  IT-Strategie &amp; Digitalisierungsfahrplan  |  Stand Juni 2026  |  Intern – Vertraulich</w:t>
+              <w:t>Kling &amp; Freitag GmbH  |  IT-Strategie &amp; Digitalisierungsfahrplan  |  Odoo Go-live: 1. Oktober 2026  |  Intern – Vertraulich</w:t>
             </w:r>
           </w:p>
         </w:tc>

</xml_diff>